<commit_message>
update JDT and documentation
</commit_message>
<xml_diff>
--- a/documents/documentation/documentation.docx
+++ b/documents/documentation/documentation.docx
@@ -14347,13 +14347,13 @@
         <w:pStyle w:val="Titre3"/>
       </w:pPr>
       <w:bookmarkStart w:id="11" w:name="_Toc185663460"/>
-      <w:bookmarkStart w:id="12" w:name="_Toc185663458"/>
-      <w:bookmarkStart w:id="13" w:name="_Toc192686655"/>
+      <w:bookmarkStart w:id="12" w:name="_Toc192686655"/>
+      <w:bookmarkStart w:id="13" w:name="_Toc185663458"/>
       <w:r>
         <w:t>Opérationnel</w:t>
       </w:r>
       <w:bookmarkEnd w:id="11"/>
-      <w:bookmarkEnd w:id="13"/>
+      <w:bookmarkEnd w:id="12"/>
     </w:p>
     <w:p/>
     <w:p>
@@ -14603,7 +14603,7 @@
       <w:r>
         <w:t>Développement</w:t>
       </w:r>
-      <w:bookmarkEnd w:id="12"/>
+      <w:bookmarkEnd w:id="13"/>
       <w:bookmarkEnd w:id="23"/>
     </w:p>
     <w:p>
@@ -15118,8 +15118,8 @@
           <w:iCs/>
         </w:rPr>
       </w:pPr>
-      <w:bookmarkStart w:id="27" w:name="_Toc71691012"/>
-      <w:bookmarkStart w:id="28" w:name="_Toc192686660"/>
+      <w:bookmarkStart w:id="27" w:name="_Toc192686660"/>
+      <w:bookmarkStart w:id="28" w:name="_Toc71691012"/>
       <w:r>
         <w:rPr>
           <w:i w:val="0"/>
@@ -15128,7 +15128,7 @@
         <w:lastRenderedPageBreak/>
         <w:t>Analyse fonctionnelle</w:t>
       </w:r>
-      <w:bookmarkEnd w:id="28"/>
+      <w:bookmarkEnd w:id="27"/>
     </w:p>
     <w:p/>
     <w:tbl>
@@ -17231,20 +17231,429 @@
           <w:iCs/>
         </w:rPr>
       </w:pPr>
-      <w:bookmarkStart w:id="47" w:name="_Toc192686669"/>
       <w:r>
         <w:rPr>
           <w:i w:val="0"/>
           <w:iCs/>
         </w:rPr>
-        <w:t>Stratégie de test</w:t>
-      </w:r>
-      <w:bookmarkEnd w:id="27"/>
-      <w:bookmarkEnd w:id="47"/>
+        <w:t>Fonctionnement de gRPC</w:t>
+      </w:r>
+    </w:p>
+    <w:p/>
+    <w:p>
+      <w:proofErr w:type="gramStart"/>
+      <w:r>
+        <w:t>gRPC</w:t>
+      </w:r>
+      <w:proofErr w:type="gramEnd"/>
+      <w:r>
+        <w:t xml:space="preserve"> est un Framework RPC open source, moderne et performent.</w:t>
+      </w:r>
+      <w:r>
+        <w:t xml:space="preserve"> Il a originalement été développé par Google</w:t>
+      </w:r>
+      <w:r>
+        <w:t xml:space="preserve">. Il sert à effectuer des liaison </w:t>
+      </w:r>
+      <w:proofErr w:type="spellStart"/>
+      <w:r>
+        <w:t>Client/Serveur</w:t>
+      </w:r>
+      <w:proofErr w:type="spellEnd"/>
+      <w:r>
+        <w:t xml:space="preserve"> multiplateforme, il est utilisable par de multiples langages : </w:t>
+      </w:r>
+    </w:p>
+    <w:p>
+      <w:pPr>
+        <w:pStyle w:val="Paragraphedeliste"/>
+        <w:numPr>
+          <w:ilvl w:val="0"/>
+          <w:numId w:val="19"/>
+        </w:numPr>
+      </w:pPr>
+      <w:r>
+        <w:t>C# / .NET</w:t>
+      </w:r>
+    </w:p>
+    <w:p>
+      <w:pPr>
+        <w:pStyle w:val="Paragraphedeliste"/>
+        <w:numPr>
+          <w:ilvl w:val="0"/>
+          <w:numId w:val="19"/>
+        </w:numPr>
+      </w:pPr>
+      <w:r>
+        <w:t>C++</w:t>
+      </w:r>
+    </w:p>
+    <w:p>
+      <w:pPr>
+        <w:pStyle w:val="Paragraphedeliste"/>
+        <w:numPr>
+          <w:ilvl w:val="0"/>
+          <w:numId w:val="19"/>
+        </w:numPr>
+      </w:pPr>
+      <w:r>
+        <w:t>Dart</w:t>
+      </w:r>
+    </w:p>
+    <w:p>
+      <w:pPr>
+        <w:pStyle w:val="Paragraphedeliste"/>
+        <w:numPr>
+          <w:ilvl w:val="0"/>
+          <w:numId w:val="19"/>
+        </w:numPr>
+      </w:pPr>
+      <w:r>
+        <w:t>Go</w:t>
+      </w:r>
+    </w:p>
+    <w:p>
+      <w:pPr>
+        <w:pStyle w:val="Paragraphedeliste"/>
+        <w:numPr>
+          <w:ilvl w:val="0"/>
+          <w:numId w:val="19"/>
+        </w:numPr>
+      </w:pPr>
+      <w:r>
+        <w:t>Java</w:t>
+      </w:r>
+    </w:p>
+    <w:p>
+      <w:pPr>
+        <w:pStyle w:val="Paragraphedeliste"/>
+        <w:numPr>
+          <w:ilvl w:val="0"/>
+          <w:numId w:val="19"/>
+        </w:numPr>
+      </w:pPr>
+      <w:proofErr w:type="spellStart"/>
+      <w:r>
+        <w:t>Kotlin</w:t>
+      </w:r>
+      <w:proofErr w:type="spellEnd"/>
+    </w:p>
+    <w:p>
+      <w:pPr>
+        <w:pStyle w:val="Paragraphedeliste"/>
+        <w:numPr>
+          <w:ilvl w:val="0"/>
+          <w:numId w:val="19"/>
+        </w:numPr>
+      </w:pPr>
+      <w:r>
+        <w:t>Node</w:t>
+      </w:r>
+    </w:p>
+    <w:p>
+      <w:pPr>
+        <w:pStyle w:val="Paragraphedeliste"/>
+        <w:numPr>
+          <w:ilvl w:val="0"/>
+          <w:numId w:val="19"/>
+        </w:numPr>
+      </w:pPr>
+      <w:r>
+        <w:t>Objective-C</w:t>
+      </w:r>
+    </w:p>
+    <w:p>
+      <w:pPr>
+        <w:pStyle w:val="Paragraphedeliste"/>
+        <w:numPr>
+          <w:ilvl w:val="0"/>
+          <w:numId w:val="19"/>
+        </w:numPr>
+      </w:pPr>
+      <w:r>
+        <w:t>PHP</w:t>
+      </w:r>
+    </w:p>
+    <w:p>
+      <w:pPr>
+        <w:pStyle w:val="Paragraphedeliste"/>
+        <w:numPr>
+          <w:ilvl w:val="0"/>
+          <w:numId w:val="19"/>
+        </w:numPr>
+      </w:pPr>
+      <w:r>
+        <w:t>Python</w:t>
+      </w:r>
+    </w:p>
+    <w:p>
+      <w:pPr>
+        <w:pStyle w:val="Paragraphedeliste"/>
+        <w:numPr>
+          <w:ilvl w:val="0"/>
+          <w:numId w:val="19"/>
+        </w:numPr>
+      </w:pPr>
+      <w:r>
+        <w:t>Ruby</w:t>
+      </w:r>
+    </w:p>
+    <w:p>
+      <w:r>
+        <w:t xml:space="preserve">Il utilise http/2 comme moyen de transport. </w:t>
+      </w:r>
+      <w:r>
+        <w:t>Il permet l’authentification, la transmission bidirectionnelle et le control de flux.</w:t>
+      </w:r>
+    </w:p>
+    <w:p>
+      <w:pPr>
+        <w:rPr>
+          <w:b/>
+          <w:bCs/>
+        </w:rPr>
+      </w:pPr>
+      <w:r>
+        <w:lastRenderedPageBreak/>
+        <w:t>Il utilise des Protocols Buffers comme langage de description d’interface.</w:t>
+      </w:r>
+      <w:r>
+        <w:t xml:space="preserve"> Ils servent à </w:t>
+      </w:r>
+      <w:r>
+        <w:rPr>
+          <w:b/>
+          <w:bCs/>
+        </w:rPr>
+        <w:t>sérialisation</w:t>
+      </w:r>
+      <w:r>
+        <w:t xml:space="preserve"> et la </w:t>
+      </w:r>
+      <w:r>
+        <w:rPr>
+          <w:b/>
+          <w:bCs/>
+        </w:rPr>
+        <w:t>désérialisation</w:t>
+      </w:r>
+      <w:r>
+        <w:rPr>
+          <w:b/>
+          <w:bCs/>
+        </w:rPr>
+        <w:t xml:space="preserve">. </w:t>
+      </w:r>
+    </w:p>
+    <w:p>
+      <w:pPr>
+        <w:rPr>
+          <w:b/>
+          <w:bCs/>
+        </w:rPr>
+      </w:pPr>
+    </w:p>
+    <w:p>
+      <w:r>
+        <w:t xml:space="preserve">La </w:t>
+      </w:r>
+      <w:r>
+        <w:rPr>
+          <w:b/>
+          <w:bCs/>
+        </w:rPr>
+        <w:t>sérialisation</w:t>
+      </w:r>
+      <w:r>
+        <w:rPr>
+          <w:b/>
+          <w:bCs/>
+        </w:rPr>
+        <w:t xml:space="preserve"> </w:t>
+      </w:r>
+      <w:r>
+        <w:t>consiste en la conversion d’objet ou de structures de données en de plus suite de petites. Ce format converti est souvent des octets ou des bits. Cela sert à facilité le stockage ou la transmission de ces données. Dans le cas de gRPC c’est pour faciliter la transmission</w:t>
+      </w:r>
+      <w:r>
+        <w:t>.</w:t>
+      </w:r>
+    </w:p>
+    <w:p/>
+    <w:p>
+      <w:r>
+        <w:t xml:space="preserve">La </w:t>
+      </w:r>
+      <w:r>
+        <w:rPr>
+          <w:b/>
+          <w:bCs/>
+        </w:rPr>
+        <w:t>désérialisation</w:t>
+      </w:r>
+      <w:r>
+        <w:rPr>
+          <w:b/>
+          <w:bCs/>
+        </w:rPr>
+        <w:t xml:space="preserve"> </w:t>
+      </w:r>
+      <w:r>
+        <w:t>est l’action inverse. Les</w:t>
+      </w:r>
+      <w:r>
+        <w:t xml:space="preserve"> octets ou bits </w:t>
+      </w:r>
+      <w:r>
+        <w:t>sont reconvertis pour retrouver les données de base.</w:t>
+      </w:r>
+    </w:p>
+    <w:p/>
+    <w:p>
+      <w:r>
+        <w:t xml:space="preserve">Dans gRPC l’envoyeur </w:t>
+      </w:r>
+      <w:r>
+        <w:rPr>
+          <w:b/>
+          <w:bCs/>
+        </w:rPr>
+        <w:t>sérialis</w:t>
+      </w:r>
+      <w:r>
+        <w:rPr>
+          <w:b/>
+          <w:bCs/>
+        </w:rPr>
+        <w:t xml:space="preserve">e </w:t>
+      </w:r>
+      <w:r>
+        <w:t xml:space="preserve">et le receveur </w:t>
+      </w:r>
+      <w:r>
+        <w:rPr>
+          <w:b/>
+          <w:bCs/>
+        </w:rPr>
+        <w:t>désérialis</w:t>
+      </w:r>
+      <w:r>
+        <w:rPr>
+          <w:b/>
+          <w:bCs/>
+        </w:rPr>
+        <w:t xml:space="preserve">e </w:t>
+      </w:r>
+      <w:r>
+        <w:t>les données. Comme les données vont dans les deux sens, le serveur et le client effectuent ces deux tâches.</w:t>
+      </w:r>
     </w:p>
     <w:p/>
     <w:p/>
     <w:p>
+      <w:pPr>
+        <w:jc w:val="center"/>
+      </w:pPr>
+      <w:r>
+        <w:rPr>
+          <w:noProof/>
+          <w:color w:val="000000" w:themeColor="text1"/>
+        </w:rPr>
+        <w:drawing>
+          <wp:inline distT="0" distB="0" distL="0" distR="0" wp14:anchorId="6A9C6A8A" wp14:editId="7E831AE7">
+            <wp:extent cx="4162974" cy="2615979"/>
+            <wp:effectExtent l="0" t="0" r="0" b="0"/>
+            <wp:docPr id="16" name="Image 16"/>
+            <wp:cNvGraphicFramePr>
+              <a:graphicFrameLocks xmlns:a="http://schemas.openxmlformats.org/drawingml/2006/main" noChangeAspect="1"/>
+            </wp:cNvGraphicFramePr>
+            <a:graphic xmlns:a="http://schemas.openxmlformats.org/drawingml/2006/main">
+              <a:graphicData uri="http://schemas.openxmlformats.org/drawingml/2006/picture">
+                <pic:pic xmlns:pic="http://schemas.openxmlformats.org/drawingml/2006/picture">
+                  <pic:nvPicPr>
+                    <pic:cNvPr id="0" name="Picture 1"/>
+                    <pic:cNvPicPr>
+                      <a:picLocks noChangeAspect="1" noChangeArrowheads="1"/>
+                    </pic:cNvPicPr>
+                  </pic:nvPicPr>
+                  <pic:blipFill>
+                    <a:blip r:embed="rId23">
+                      <a:extLst>
+                        <a:ext uri="{28A0092B-C50C-407E-A947-70E740481C1C}">
+                          <a14:useLocalDpi xmlns:a14="http://schemas.microsoft.com/office/drawing/2010/main" val="0"/>
+                        </a:ext>
+                      </a:extLst>
+                    </a:blip>
+                    <a:srcRect/>
+                    <a:stretch>
+                      <a:fillRect/>
+                    </a:stretch>
+                  </pic:blipFill>
+                  <pic:spPr bwMode="auto">
+                    <a:xfrm>
+                      <a:off x="0" y="0"/>
+                      <a:ext cx="4164621" cy="2617014"/>
+                    </a:xfrm>
+                    <a:prstGeom prst="rect">
+                      <a:avLst/>
+                    </a:prstGeom>
+                    <a:noFill/>
+                    <a:ln>
+                      <a:noFill/>
+                    </a:ln>
+                  </pic:spPr>
+                </pic:pic>
+              </a:graphicData>
+            </a:graphic>
+          </wp:inline>
+        </w:drawing>
+      </w:r>
+    </w:p>
+    <w:p>
+      <w:pPr>
+        <w:jc w:val="center"/>
+      </w:pPr>
+    </w:p>
+    <w:p>
+      <w:proofErr w:type="gramStart"/>
+      <w:r>
+        <w:t>gRPC</w:t>
+      </w:r>
+      <w:proofErr w:type="gramEnd"/>
+      <w:r>
+        <w:t xml:space="preserve"> utilise des fichiers .proto qui sont ces Protocols Buffers. Le client et le serveur possèdent tous les deux le même fichier proto. Il peut y avoir plusieurs fichiers proto pour plusieurs requêtes possible. Par exemple dans ce projet il y en a 2, un pour l’annonce du client vers le serveur et un pour le </w:t>
+      </w:r>
+      <w:proofErr w:type="spellStart"/>
+      <w:r>
+        <w:t>heartBeat</w:t>
+      </w:r>
+      <w:proofErr w:type="spellEnd"/>
+      <w:r>
+        <w:t>.</w:t>
+      </w:r>
+    </w:p>
+    <w:p/>
+    <w:p>
+      <w:pPr>
+        <w:pStyle w:val="Titre2"/>
+        <w:rPr>
+          <w:i w:val="0"/>
+          <w:iCs/>
+        </w:rPr>
+      </w:pPr>
+      <w:bookmarkStart w:id="47" w:name="_Toc192686669"/>
+      <w:r>
+        <w:rPr>
+          <w:i w:val="0"/>
+          <w:iCs/>
+        </w:rPr>
+        <w:t>Stratégie de test</w:t>
+      </w:r>
+      <w:bookmarkEnd w:id="28"/>
+      <w:bookmarkEnd w:id="47"/>
+    </w:p>
+    <w:p/>
+    <w:p/>
+    <w:p>
       <w:r>
         <w:t>Les postes élèves seront simulés par des laptops avec des comptes admin locaux.</w:t>
       </w:r>
@@ -17269,6 +17678,7 @@
     <w:p/>
     <w:p>
       <w:r>
+        <w:lastRenderedPageBreak/>
         <w:t>Au démarrage du test on lance en premier la partie sur les portables, donc la partie de scan des élèves. Ensuite, on lance la partie graphique sur le pc du prof.</w:t>
       </w:r>
     </w:p>
@@ -17326,7 +17736,6 @@
         <w:rPr>
           <w:szCs w:val="14"/>
         </w:rPr>
-        <w:lastRenderedPageBreak/>
         <w:t>Voir Section</w:t>
       </w:r>
       <w:r>
@@ -17788,15 +18197,17 @@
       <w:r>
         <w:t xml:space="preserve">Pour les vérifications, ça </w:t>
       </w:r>
-      <w:proofErr w:type="spellStart"/>
-      <w:proofErr w:type="gramStart"/>
-      <w:r>
-        <w:t>ce</w:t>
-      </w:r>
-      <w:proofErr w:type="spellEnd"/>
-      <w:proofErr w:type="gramEnd"/>
-      <w:r>
-        <w:t xml:space="preserve"> passe dans cet ordre, ShadowScan (coté prof) essaye de se connecter au serveur gRPC si il y arrive le pc est Connecté</w:t>
+      <w:r>
+        <w:t>se</w:t>
+      </w:r>
+      <w:r>
+        <w:t xml:space="preserve"> passe dans cet ordre, ShadowScan (coté prof) essaye de se connecter au serveur gRPC </w:t>
+      </w:r>
+      <w:r>
+        <w:t>s’il</w:t>
+      </w:r>
+      <w:r>
+        <w:t xml:space="preserve"> y arrive le pc est Connecté</w:t>
       </w:r>
       <w:r>
         <w:t>.</w:t>
@@ -17807,16 +18218,69 @@
         <w:ind w:left="576"/>
       </w:pPr>
       <w:r>
+        <w:lastRenderedPageBreak/>
         <w:t xml:space="preserve">Si cela échoue, il ping le pc et </w:t>
       </w:r>
-      <w:proofErr w:type="gramStart"/>
-      <w:r>
-        <w:t>si il</w:t>
-      </w:r>
-      <w:proofErr w:type="gramEnd"/>
-      <w:r>
-        <w:t xml:space="preserve"> y parvient, le pc est En ligne et si il échoue, il est Hors ligne.</w:t>
-      </w:r>
+      <w:r>
+        <w:t>s’il</w:t>
+      </w:r>
+      <w:r>
+        <w:t xml:space="preserve"> y parvient, le pc est En ligne et </w:t>
+      </w:r>
+      <w:r>
+        <w:t>s’il</w:t>
+      </w:r>
+      <w:r>
+        <w:t xml:space="preserve"> échoue, il est Hors ligne.</w:t>
+      </w:r>
+    </w:p>
+    <w:p>
+      <w:pPr>
+        <w:ind w:left="576"/>
+      </w:pPr>
+    </w:p>
+    <w:p>
+      <w:pPr>
+        <w:pStyle w:val="Titre3"/>
+      </w:pPr>
+      <w:r>
+        <w:t>Le Heart Beat</w:t>
+      </w:r>
+    </w:p>
+    <w:p/>
+    <w:p>
+      <w:pPr>
+        <w:ind w:left="576"/>
+      </w:pPr>
+      <w:r>
+        <w:t xml:space="preserve">Pour </w:t>
+      </w:r>
+      <w:r>
+        <w:t>vérifi</w:t>
+      </w:r>
+      <w:r>
+        <w:t xml:space="preserve">er que le client ne se déconnecte pas au milieu du teste, il y a un </w:t>
+      </w:r>
+      <w:r>
+        <w:t>Heart Beat</w:t>
+      </w:r>
+      <w:r>
+        <w:t xml:space="preserve"> </w:t>
+      </w:r>
+      <w:r>
+        <w:t xml:space="preserve">qui est envoyé à intervalle régulier depuis le serveur (le poste élève) au client (le laptop du prof). Si le client arête ce Heart Beat alors le statu du pc changera et le prof en sera informé grâce au niveau de connexion sur la page qui permet de visualiser </w:t>
+      </w:r>
+      <w:r>
+        <w:t>tous les postes</w:t>
+      </w:r>
+      <w:r>
+        <w:t xml:space="preserve">. </w:t>
+      </w:r>
+    </w:p>
+    <w:p>
+      <w:pPr>
+        <w:ind w:left="576"/>
+      </w:pPr>
     </w:p>
     <w:p>
       <w:pPr>
@@ -17883,11 +18347,9 @@
         <w:tab/>
         <w:t xml:space="preserve">Pas </w:t>
       </w:r>
-      <w:proofErr w:type="gramStart"/>
-      <w:r>
-        <w:t>de user</w:t>
-      </w:r>
-      <w:proofErr w:type="gramEnd"/>
+      <w:r>
+        <w:t>d’user</w:t>
+      </w:r>
       <w:r>
         <w:t xml:space="preserve"> stories complétées, </w:t>
       </w:r>
@@ -17897,7 +18359,6 @@
         <w:ind w:left="708"/>
       </w:pPr>
       <w:r>
-        <w:lastRenderedPageBreak/>
         <w:t xml:space="preserve">La </w:t>
       </w:r>
       <w:proofErr w:type="spellStart"/>
@@ -18389,7 +18850,6 @@
         <w:ind w:left="708"/>
       </w:pPr>
       <w:r>
-        <w:lastRenderedPageBreak/>
         <w:t xml:space="preserve">La </w:t>
       </w:r>
       <w:proofErr w:type="spellStart"/>
@@ -18680,6 +19140,7 @@
         <w:ind w:left="705"/>
       </w:pPr>
       <w:r>
+        <w:lastRenderedPageBreak/>
         <w:t>Pouvoir recevoir un popup quand un dépassement est détecté sur mon post et quel est la ressource interdite.</w:t>
       </w:r>
       <w:r>
@@ -18779,9 +19240,9 @@
           <w:iCs/>
         </w:rPr>
       </w:pPr>
-      <w:bookmarkStart w:id="62" w:name="_Toc25553321"/>
-      <w:bookmarkStart w:id="63" w:name="_Toc71691025"/>
-      <w:bookmarkStart w:id="64" w:name="_Toc192686678"/>
+      <w:bookmarkStart w:id="62" w:name="_Toc192686678"/>
+      <w:bookmarkStart w:id="63" w:name="_Toc25553321"/>
+      <w:bookmarkStart w:id="64" w:name="_Toc71691025"/>
       <w:bookmarkEnd w:id="53"/>
       <w:bookmarkEnd w:id="54"/>
       <w:r>
@@ -18791,7 +19252,7 @@
         </w:rPr>
         <w:t>Mise en place de l’environnement de travail</w:t>
       </w:r>
-      <w:bookmarkEnd w:id="64"/>
+      <w:bookmarkEnd w:id="62"/>
     </w:p>
     <w:p/>
     <w:p>
@@ -18805,7 +19266,6 @@
         <w:rPr>
           <w:u w:val="single"/>
         </w:rPr>
-        <w:lastRenderedPageBreak/>
         <w:t>Version des logiciels :</w:t>
       </w:r>
     </w:p>
@@ -19083,6 +19543,7 @@
         <w:ind w:left="1410"/>
       </w:pPr>
       <w:r>
+        <w:lastRenderedPageBreak/>
         <w:t xml:space="preserve">Il n’y a pas de setup supplémentaire de ce côté. </w:t>
       </w:r>
       <w:r>
@@ -19279,7 +19740,6 @@
         <w:ind w:left="2124"/>
       </w:pPr>
       <w:r>
-        <w:lastRenderedPageBreak/>
         <w:t>Fichier du coté prof, il sert à enregistrer la liste principale des ressources bannies</w:t>
       </w:r>
       <w:r>
@@ -19512,6 +19972,7 @@
         <w:ind w:left="1410"/>
       </w:pPr>
       <w:r>
+        <w:lastRenderedPageBreak/>
         <w:t>Il faut que cette partie du code soit exécutée après la partie serveur.</w:t>
       </w:r>
     </w:p>
@@ -19861,7 +20322,7 @@
         </w:rPr>
         <w:t>Description des test</w:t>
       </w:r>
-      <w:bookmarkEnd w:id="62"/>
+      <w:bookmarkEnd w:id="63"/>
       <w:r>
         <w:rPr>
           <w:i w:val="0"/>
@@ -19869,185 +20330,950 @@
         </w:rPr>
         <w:t>s effectués</w:t>
       </w:r>
-      <w:bookmarkEnd w:id="63"/>
+      <w:bookmarkEnd w:id="64"/>
       <w:bookmarkEnd w:id="67"/>
     </w:p>
-    <w:p>
-      <w:pPr>
-        <w:pStyle w:val="En-tte"/>
-        <w:ind w:left="357"/>
-        <w:rPr>
-          <w:i/>
-        </w:rPr>
-      </w:pPr>
-    </w:p>
-    <w:p>
-      <w:pPr>
-        <w:pStyle w:val="En-tte"/>
-        <w:ind w:left="357"/>
-        <w:rPr>
-          <w:i/>
-          <w:strike/>
-        </w:rPr>
-      </w:pPr>
-      <w:r>
-        <w:rPr>
-          <w:i/>
-          <w:strike/>
-        </w:rPr>
-        <w:t xml:space="preserve">Pour chaque partie testée de votre projet, il faut </w:t>
-      </w:r>
-      <w:proofErr w:type="gramStart"/>
-      <w:r>
-        <w:rPr>
-          <w:i/>
-          <w:strike/>
-        </w:rPr>
-        <w:t>décrire:</w:t>
-      </w:r>
-      <w:proofErr w:type="gramEnd"/>
-    </w:p>
-    <w:p>
-      <w:pPr>
-        <w:pStyle w:val="En-tte"/>
-        <w:ind w:left="357"/>
-        <w:rPr>
-          <w:i/>
-          <w:strike/>
-        </w:rPr>
-      </w:pPr>
-    </w:p>
-    <w:p>
-      <w:pPr>
-        <w:numPr>
-          <w:ilvl w:val="0"/>
-          <w:numId w:val="13"/>
-        </w:numPr>
-        <w:suppressAutoHyphens/>
-        <w:rPr>
-          <w:i/>
-          <w:strike/>
-        </w:rPr>
-      </w:pPr>
-      <w:proofErr w:type="gramStart"/>
-      <w:r>
-        <w:rPr>
-          <w:i/>
-          <w:strike/>
-        </w:rPr>
-        <w:t>les</w:t>
-      </w:r>
-      <w:proofErr w:type="gramEnd"/>
-      <w:r>
-        <w:rPr>
-          <w:i/>
-          <w:strike/>
-        </w:rPr>
-        <w:t xml:space="preserve"> conditions exactes de chaque test</w:t>
-      </w:r>
-    </w:p>
-    <w:p>
-      <w:pPr>
-        <w:numPr>
-          <w:ilvl w:val="0"/>
-          <w:numId w:val="12"/>
-        </w:numPr>
-        <w:rPr>
-          <w:i/>
-          <w:strike/>
-        </w:rPr>
-      </w:pPr>
-      <w:proofErr w:type="gramStart"/>
-      <w:r>
-        <w:rPr>
-          <w:i/>
-          <w:strike/>
-        </w:rPr>
-        <w:t>les</w:t>
-      </w:r>
-      <w:proofErr w:type="gramEnd"/>
-      <w:r>
-        <w:rPr>
-          <w:i/>
-          <w:strike/>
-        </w:rPr>
-        <w:t xml:space="preserve"> preuves de test (papier ou fichier)</w:t>
-      </w:r>
-    </w:p>
-    <w:p>
-      <w:pPr>
-        <w:numPr>
-          <w:ilvl w:val="0"/>
-          <w:numId w:val="12"/>
-        </w:numPr>
-        <w:rPr>
-          <w:i/>
-          <w:strike/>
-        </w:rPr>
-      </w:pPr>
-      <w:proofErr w:type="gramStart"/>
-      <w:r>
-        <w:rPr>
-          <w:i/>
-          <w:strike/>
-        </w:rPr>
-        <w:t>tests</w:t>
-      </w:r>
-      <w:proofErr w:type="gramEnd"/>
-      <w:r>
-        <w:rPr>
-          <w:i/>
-          <w:strike/>
-        </w:rPr>
-        <w:t xml:space="preserve"> sans preuve: fournir au moins une description </w:t>
-      </w:r>
-    </w:p>
-    <w:p>
-      <w:pPr>
-        <w:ind w:left="1134" w:hanging="774"/>
-        <w:rPr>
-          <w:b/>
-          <w:bCs/>
-          <w:i/>
-          <w:iCs/>
-          <w:color w:val="FF0000"/>
-        </w:rPr>
-      </w:pPr>
-    </w:p>
-    <w:p>
-      <w:pPr>
-        <w:ind w:left="1134" w:hanging="774"/>
-        <w:rPr>
-          <w:b/>
-          <w:bCs/>
-          <w:i/>
-          <w:iCs/>
-          <w:color w:val="FF0000"/>
-        </w:rPr>
-      </w:pPr>
-      <w:r>
-        <w:rPr>
-          <w:b/>
-          <w:bCs/>
-          <w:i/>
-          <w:iCs/>
-          <w:color w:val="FF0000"/>
-        </w:rPr>
-        <w:t>Reprendre les tests d’acceptance d’IceScrum au moyen de la feuille ad hoc d’</w:t>
+    <w:p/>
+    <w:p>
+      <w:pPr>
+        <w:pStyle w:val="Titre3"/>
+      </w:pPr>
+      <w:r>
+        <w:t>Sprint 1</w:t>
+      </w:r>
+    </w:p>
+    <w:p>
+      <w:r>
+        <w:tab/>
+        <w:t>Pas de stories complétée sur ce sprint</w:t>
+      </w:r>
+    </w:p>
+    <w:p/>
+    <w:p>
+      <w:pPr>
+        <w:pStyle w:val="Titre3"/>
+      </w:pPr>
+      <w:r>
+        <w:lastRenderedPageBreak/>
+        <w:t>Sprint 2</w:t>
+      </w:r>
+    </w:p>
+    <w:p/>
+    <w:p>
+      <w:pPr>
+        <w:pStyle w:val="Titre4"/>
+      </w:pPr>
+      <w:r>
+        <w:t>Sélectionner les Pcs à monitorer</w:t>
+      </w:r>
+    </w:p>
+    <w:tbl>
+      <w:tblPr>
+        <w:tblW w:w="100" w:type="auto"/>
+        <w:tblBorders>
+          <w:top w:val="single" w:sz="4" w:space="0" w:color="auto"/>
+          <w:left w:val="single" w:sz="4" w:space="0" w:color="auto"/>
+          <w:bottom w:val="single" w:sz="4" w:space="0" w:color="auto"/>
+          <w:right w:val="single" w:sz="4" w:space="0" w:color="auto"/>
+          <w:insideH w:val="single" w:sz="4" w:space="0" w:color="auto"/>
+          <w:insideV w:val="single" w:sz="4" w:space="0" w:color="auto"/>
+        </w:tblBorders>
+        <w:tblCellMar>
+          <w:left w:w="10" w:type="dxa"/>
+          <w:right w:w="10" w:type="dxa"/>
+        </w:tblCellMar>
+        <w:tblLook w:val="04A0" w:firstRow="1" w:lastRow="0" w:firstColumn="1" w:lastColumn="0" w:noHBand="0" w:noVBand="1"/>
+      </w:tblPr>
+      <w:tblGrid>
+        <w:gridCol w:w="1850"/>
+        <w:gridCol w:w="6679"/>
+        <w:gridCol w:w="561"/>
+      </w:tblGrid>
+      <w:tr>
+        <w:tblPrEx>
+          <w:tblCellMar>
+            <w:top w:w="0" w:type="dxa"/>
+            <w:bottom w:w="0" w:type="dxa"/>
+          </w:tblCellMar>
+        </w:tblPrEx>
+        <w:tc>
+          <w:tcPr>
+            <w:tcW w:w="0" w:type="auto"/>
+          </w:tcPr>
+          <w:p>
+            <w:r>
+              <w:t>Sélection des pcs à monitorer</w:t>
+            </w:r>
+          </w:p>
+        </w:tc>
+        <w:tc>
+          <w:tcPr>
+            <w:tcW w:w="0" w:type="auto"/>
+          </w:tcPr>
+          <w:p>
+            <w:r>
+              <w:t xml:space="preserve">Contexte :  On a détecté nos machines via le nom de la salle </w:t>
+            </w:r>
+          </w:p>
+          <w:p>
+            <w:r>
+              <w:t xml:space="preserve">Action :  on sélectionne via les </w:t>
+            </w:r>
+            <w:proofErr w:type="spellStart"/>
+            <w:r>
+              <w:t>checkbox</w:t>
+            </w:r>
+            <w:proofErr w:type="spellEnd"/>
+            <w:r>
+              <w:t xml:space="preserve"> des machines qu'on veut monitorer Résultat :   les machines sélectionnées ont leur </w:t>
+            </w:r>
+            <w:proofErr w:type="spellStart"/>
+            <w:r>
+              <w:t>textbox</w:t>
+            </w:r>
+            <w:proofErr w:type="spellEnd"/>
+            <w:r>
+              <w:t xml:space="preserve"> </w:t>
+            </w:r>
+            <w:proofErr w:type="spellStart"/>
+            <w:r>
+              <w:t>chequées</w:t>
+            </w:r>
+            <w:proofErr w:type="spellEnd"/>
+          </w:p>
+        </w:tc>
+        <w:tc>
+          <w:tcPr>
+            <w:tcW w:w="0" w:type="auto"/>
+          </w:tcPr>
+          <w:p>
+            <w:r>
+              <w:t>OK</w:t>
+            </w:r>
+          </w:p>
+          <w:p>
+            <w:r>
+              <w:t xml:space="preserve">24 </w:t>
+            </w:r>
+            <w:proofErr w:type="spellStart"/>
+            <w:r>
+              <w:t>Feb</w:t>
+            </w:r>
+            <w:proofErr w:type="spellEnd"/>
+          </w:p>
+        </w:tc>
+      </w:tr>
+    </w:tbl>
+    <w:p/>
+    <w:p>
+      <w:pPr>
+        <w:pStyle w:val="Titre4"/>
+      </w:pPr>
+      <w:r>
+        <w:t>Manager une sous liste de ressource bannies</w:t>
+      </w:r>
+    </w:p>
+    <w:tbl>
+      <w:tblPr>
+        <w:tblW w:w="100" w:type="auto"/>
+        <w:tblBorders>
+          <w:top w:val="single" w:sz="4" w:space="0" w:color="auto"/>
+          <w:left w:val="single" w:sz="4" w:space="0" w:color="auto"/>
+          <w:bottom w:val="single" w:sz="4" w:space="0" w:color="auto"/>
+          <w:right w:val="single" w:sz="4" w:space="0" w:color="auto"/>
+          <w:insideH w:val="single" w:sz="4" w:space="0" w:color="auto"/>
+          <w:insideV w:val="single" w:sz="4" w:space="0" w:color="auto"/>
+        </w:tblBorders>
+        <w:tblCellMar>
+          <w:left w:w="10" w:type="dxa"/>
+          <w:right w:w="10" w:type="dxa"/>
+        </w:tblCellMar>
+        <w:tblLook w:val="04A0" w:firstRow="1" w:lastRow="0" w:firstColumn="1" w:lastColumn="0" w:noHBand="0" w:noVBand="1"/>
+      </w:tblPr>
+      <w:tblGrid>
+        <w:gridCol w:w="1864"/>
+        <w:gridCol w:w="6637"/>
+        <w:gridCol w:w="589"/>
+      </w:tblGrid>
+      <w:tr>
+        <w:tblPrEx>
+          <w:tblCellMar>
+            <w:top w:w="0" w:type="dxa"/>
+            <w:bottom w:w="0" w:type="dxa"/>
+          </w:tblCellMar>
+        </w:tblPrEx>
+        <w:tc>
+          <w:tcPr>
+            <w:tcW w:w="0" w:type="auto"/>
+          </w:tcPr>
+          <w:p>
+            <w:r>
+              <w:t>Ajouter une ressource</w:t>
+            </w:r>
+          </w:p>
+        </w:tc>
+        <w:tc>
+          <w:tcPr>
+            <w:tcW w:w="0" w:type="auto"/>
+          </w:tcPr>
+          <w:p>
+            <w:r>
+              <w:t xml:space="preserve">Contexte :  on est sur la page pour ajouter un élément à la liste </w:t>
+            </w:r>
+          </w:p>
+          <w:p>
+            <w:r>
+              <w:t xml:space="preserve">Action :  on clique sur une ressource dans la liste des ressources et on appuie sur le bouton ajouter (au centre) </w:t>
+            </w:r>
+          </w:p>
+          <w:p>
+            <w:r>
+              <w:t>Résultat :   la ressource est ajoutée à la liste</w:t>
+            </w:r>
+          </w:p>
+        </w:tc>
+        <w:tc>
+          <w:tcPr>
+            <w:tcW w:w="0" w:type="auto"/>
+          </w:tcPr>
+          <w:p>
+            <w:r>
+              <w:t>OK</w:t>
+            </w:r>
+          </w:p>
+          <w:p>
+            <w:r>
+              <w:t xml:space="preserve">24 </w:t>
+            </w:r>
+            <w:proofErr w:type="spellStart"/>
+            <w:r>
+              <w:t>Feb</w:t>
+            </w:r>
+            <w:proofErr w:type="spellEnd"/>
+          </w:p>
+        </w:tc>
+      </w:tr>
+      <w:tr>
+        <w:tblPrEx>
+          <w:tblCellMar>
+            <w:top w:w="0" w:type="dxa"/>
+            <w:bottom w:w="0" w:type="dxa"/>
+          </w:tblCellMar>
+        </w:tblPrEx>
+        <w:tc>
+          <w:tcPr>
+            <w:tcW w:w="0" w:type="auto"/>
+          </w:tcPr>
+          <w:p>
+            <w:r>
+              <w:t>Supprimer une ressource</w:t>
+            </w:r>
+          </w:p>
+        </w:tc>
+        <w:tc>
+          <w:tcPr>
+            <w:tcW w:w="0" w:type="auto"/>
+          </w:tcPr>
+          <w:p>
+            <w:r>
+              <w:t xml:space="preserve">Contexte :  on est sur la page pour ajouter un élément à la liste </w:t>
+            </w:r>
+          </w:p>
+          <w:p>
+            <w:r>
+              <w:t xml:space="preserve">Action :  on clique sur une ressource dans la sous liste des ressources et on appuie sur le bouton supprimer (en dessous) </w:t>
+            </w:r>
+          </w:p>
+          <w:p>
+            <w:r>
+              <w:t>Résultat :   la ressource est supprimée à la liste</w:t>
+            </w:r>
+          </w:p>
+        </w:tc>
+        <w:tc>
+          <w:tcPr>
+            <w:tcW w:w="0" w:type="auto"/>
+          </w:tcPr>
+          <w:p>
+            <w:r>
+              <w:t>OK</w:t>
+            </w:r>
+          </w:p>
+          <w:p>
+            <w:r>
+              <w:t xml:space="preserve">24 </w:t>
+            </w:r>
+            <w:proofErr w:type="spellStart"/>
+            <w:r>
+              <w:t>Feb</w:t>
+            </w:r>
+            <w:proofErr w:type="spellEnd"/>
+          </w:p>
+        </w:tc>
+      </w:tr>
+    </w:tbl>
+    <w:p/>
+    <w:p>
+      <w:pPr>
+        <w:pStyle w:val="Titre3"/>
+      </w:pPr>
+      <w:r>
+        <w:t>Sprint 3</w:t>
+      </w:r>
+    </w:p>
+    <w:p/>
+    <w:p>
+      <w:pPr>
+        <w:pStyle w:val="Titre4"/>
+      </w:pPr>
+      <w:r>
+        <w:t>Manager des éléments à la liste de toutes les ressources</w:t>
+      </w:r>
+    </w:p>
+    <w:tbl>
+      <w:tblPr>
+        <w:tblW w:w="100" w:type="auto"/>
+        <w:tblBorders>
+          <w:top w:val="single" w:sz="4" w:space="0" w:color="auto"/>
+          <w:left w:val="single" w:sz="4" w:space="0" w:color="auto"/>
+          <w:bottom w:val="single" w:sz="4" w:space="0" w:color="auto"/>
+          <w:right w:val="single" w:sz="4" w:space="0" w:color="auto"/>
+          <w:insideH w:val="single" w:sz="4" w:space="0" w:color="auto"/>
+          <w:insideV w:val="single" w:sz="4" w:space="0" w:color="auto"/>
+        </w:tblBorders>
+        <w:tblCellMar>
+          <w:left w:w="10" w:type="dxa"/>
+          <w:right w:w="10" w:type="dxa"/>
+        </w:tblCellMar>
+        <w:tblLook w:val="04A0" w:firstRow="1" w:lastRow="0" w:firstColumn="1" w:lastColumn="0" w:noHBand="0" w:noVBand="1"/>
+      </w:tblPr>
+      <w:tblGrid>
+        <w:gridCol w:w="1713"/>
+        <w:gridCol w:w="6859"/>
+        <w:gridCol w:w="518"/>
+      </w:tblGrid>
+      <w:tr>
+        <w:tblPrEx>
+          <w:tblCellMar>
+            <w:top w:w="0" w:type="dxa"/>
+            <w:bottom w:w="0" w:type="dxa"/>
+          </w:tblCellMar>
+        </w:tblPrEx>
+        <w:tc>
+          <w:tcPr>
+            <w:tcW w:w="0" w:type="auto"/>
+          </w:tcPr>
+          <w:p>
+            <w:r>
+              <w:t>Ajouter un élément à la liste</w:t>
+            </w:r>
+          </w:p>
+        </w:tc>
+        <w:tc>
+          <w:tcPr>
+            <w:tcW w:w="0" w:type="auto"/>
+          </w:tcPr>
+          <w:p>
+            <w:r>
+              <w:t xml:space="preserve">Contexte :  on est sur la page pour ajouter un élément à la liste </w:t>
+            </w:r>
+          </w:p>
+          <w:p>
+            <w:r>
+              <w:t xml:space="preserve">Action :  on ajoute un lien/nom d'application/nom de fichier dans le champ et on appuie sur le bouton ajouter </w:t>
+            </w:r>
+          </w:p>
+          <w:p>
+            <w:r>
+              <w:t>Résultat :   la ressource est ajoutée à la liste</w:t>
+            </w:r>
+          </w:p>
+        </w:tc>
+        <w:tc>
+          <w:tcPr>
+            <w:tcW w:w="0" w:type="auto"/>
+          </w:tcPr>
+          <w:p>
+            <w:r>
+              <w:t>OK</w:t>
+            </w:r>
+          </w:p>
+          <w:p>
+            <w:r>
+              <w:t xml:space="preserve">24 </w:t>
+            </w:r>
+            <w:proofErr w:type="spellStart"/>
+            <w:r>
+              <w:t>Feb</w:t>
+            </w:r>
+            <w:proofErr w:type="spellEnd"/>
+          </w:p>
+        </w:tc>
+      </w:tr>
+      <w:tr>
+        <w:tblPrEx>
+          <w:tblCellMar>
+            <w:top w:w="0" w:type="dxa"/>
+            <w:bottom w:w="0" w:type="dxa"/>
+          </w:tblCellMar>
+        </w:tblPrEx>
+        <w:tc>
+          <w:tcPr>
+            <w:tcW w:w="0" w:type="auto"/>
+          </w:tcPr>
+          <w:p>
+            <w:r>
+              <w:t>Supprimer un élément de la liste</w:t>
+            </w:r>
+          </w:p>
+        </w:tc>
+        <w:tc>
+          <w:tcPr>
+            <w:tcW w:w="0" w:type="auto"/>
+          </w:tcPr>
+          <w:p>
+            <w:r>
+              <w:t xml:space="preserve">Contexte :  on est sur la page pour ajouter un élément à la liste </w:t>
+            </w:r>
+          </w:p>
+          <w:p>
+            <w:r>
+              <w:t xml:space="preserve">Action :  on </w:t>
+            </w:r>
+            <w:r>
+              <w:t>clique</w:t>
+            </w:r>
+            <w:r>
+              <w:t xml:space="preserve"> sur un lien/nom d'application/nom de fichier dans la liste pour le sélectionner (sélection multiple possible) et on appuie sur le bouton supprimer Résultat :   la ressource est retirée à la liste</w:t>
+            </w:r>
+          </w:p>
+        </w:tc>
+        <w:tc>
+          <w:tcPr>
+            <w:tcW w:w="0" w:type="auto"/>
+          </w:tcPr>
+          <w:p>
+            <w:r>
+              <w:t>OK</w:t>
+            </w:r>
+          </w:p>
+          <w:p>
+            <w:r>
+              <w:t>7 Mar</w:t>
+            </w:r>
+          </w:p>
+        </w:tc>
+      </w:tr>
+    </w:tbl>
+    <w:p/>
+    <w:p>
+      <w:pPr>
+        <w:pStyle w:val="Titre4"/>
+      </w:pPr>
+      <w:r>
+        <w:t>Popup quand un dépassement est détecté (élève)</w:t>
+      </w:r>
+    </w:p>
+    <w:tbl>
+      <w:tblPr>
+        <w:tblW w:w="100" w:type="auto"/>
+        <w:tblBorders>
+          <w:top w:val="single" w:sz="4" w:space="0" w:color="auto"/>
+          <w:left w:val="single" w:sz="4" w:space="0" w:color="auto"/>
+          <w:bottom w:val="single" w:sz="4" w:space="0" w:color="auto"/>
+          <w:right w:val="single" w:sz="4" w:space="0" w:color="auto"/>
+          <w:insideH w:val="single" w:sz="4" w:space="0" w:color="auto"/>
+          <w:insideV w:val="single" w:sz="4" w:space="0" w:color="auto"/>
+        </w:tblBorders>
+        <w:tblCellMar>
+          <w:left w:w="10" w:type="dxa"/>
+          <w:right w:w="10" w:type="dxa"/>
+        </w:tblCellMar>
+        <w:tblLook w:val="04A0" w:firstRow="1" w:lastRow="0" w:firstColumn="1" w:lastColumn="0" w:noHBand="0" w:noVBand="1"/>
+      </w:tblPr>
+      <w:tblGrid>
+        <w:gridCol w:w="2218"/>
+        <w:gridCol w:w="6331"/>
+        <w:gridCol w:w="541"/>
+      </w:tblGrid>
+      <w:tr>
+        <w:tblPrEx>
+          <w:tblCellMar>
+            <w:top w:w="0" w:type="dxa"/>
+            <w:bottom w:w="0" w:type="dxa"/>
+          </w:tblCellMar>
+        </w:tblPrEx>
+        <w:tc>
+          <w:tcPr>
+            <w:tcW w:w="0" w:type="auto"/>
+          </w:tcPr>
+          <w:p>
+            <w:r>
+              <w:t>Détection de dépassement</w:t>
+            </w:r>
+          </w:p>
+        </w:tc>
+        <w:tc>
+          <w:tcPr>
+            <w:tcW w:w="0" w:type="auto"/>
+          </w:tcPr>
+          <w:p>
+            <w:r>
+              <w:t xml:space="preserve">Contexte :  on est sur le poste en train de travailler </w:t>
+            </w:r>
+          </w:p>
+          <w:p>
+            <w:r>
+              <w:t xml:space="preserve">Action :  on accède à </w:t>
+            </w:r>
+            <w:r>
+              <w:t>T</w:t>
+            </w:r>
+            <w:r>
+              <w:t xml:space="preserve">eams </w:t>
+            </w:r>
+          </w:p>
+          <w:p>
+            <w:r>
+              <w:t>Résultat :   un popup Windows nous informe du dépassement avec le nom de la ressource interdite</w:t>
+            </w:r>
+          </w:p>
+        </w:tc>
+        <w:tc>
+          <w:tcPr>
+            <w:tcW w:w="0" w:type="auto"/>
+          </w:tcPr>
+          <w:p>
+            <w:r>
+              <w:t>OK</w:t>
+            </w:r>
+          </w:p>
+          <w:p>
+            <w:r>
+              <w:t>7 Mar</w:t>
+            </w:r>
+          </w:p>
+        </w:tc>
+      </w:tr>
+    </w:tbl>
+    <w:p/>
+    <w:p>
+      <w:pPr>
+        <w:pStyle w:val="Titre4"/>
+      </w:pPr>
+      <w:r>
+        <w:t xml:space="preserve">Détecter les </w:t>
       </w:r>
       <w:proofErr w:type="spellStart"/>
       <w:r>
-        <w:rPr>
-          <w:b/>
-          <w:bCs/>
-          <w:i/>
-          <w:iCs/>
-          <w:color w:val="FF0000"/>
-        </w:rPr>
-        <w:t>IceTools</w:t>
+        <w:t>posts</w:t>
       </w:r>
       <w:proofErr w:type="spellEnd"/>
-    </w:p>
+      <w:r>
+        <w:t xml:space="preserve"> d'une salle</w:t>
+      </w:r>
+    </w:p>
+    <w:tbl>
+      <w:tblPr>
+        <w:tblW w:w="100" w:type="auto"/>
+        <w:tblBorders>
+          <w:top w:val="single" w:sz="4" w:space="0" w:color="auto"/>
+          <w:left w:val="single" w:sz="4" w:space="0" w:color="auto"/>
+          <w:bottom w:val="single" w:sz="4" w:space="0" w:color="auto"/>
+          <w:right w:val="single" w:sz="4" w:space="0" w:color="auto"/>
+          <w:insideH w:val="single" w:sz="4" w:space="0" w:color="auto"/>
+          <w:insideV w:val="single" w:sz="4" w:space="0" w:color="auto"/>
+        </w:tblBorders>
+        <w:tblCellMar>
+          <w:left w:w="10" w:type="dxa"/>
+          <w:right w:w="10" w:type="dxa"/>
+        </w:tblCellMar>
+        <w:tblLook w:val="04A0" w:firstRow="1" w:lastRow="0" w:firstColumn="1" w:lastColumn="0" w:noHBand="0" w:noVBand="1"/>
+      </w:tblPr>
+      <w:tblGrid>
+        <w:gridCol w:w="1648"/>
+        <w:gridCol w:w="6908"/>
+        <w:gridCol w:w="534"/>
+      </w:tblGrid>
+      <w:tr>
+        <w:tblPrEx>
+          <w:tblCellMar>
+            <w:top w:w="0" w:type="dxa"/>
+            <w:bottom w:w="0" w:type="dxa"/>
+          </w:tblCellMar>
+        </w:tblPrEx>
+        <w:tc>
+          <w:tcPr>
+            <w:tcW w:w="0" w:type="auto"/>
+          </w:tcPr>
+          <w:p>
+            <w:r>
+              <w:t>Détection des postes</w:t>
+            </w:r>
+          </w:p>
+        </w:tc>
+        <w:tc>
+          <w:tcPr>
+            <w:tcW w:w="0" w:type="auto"/>
+          </w:tcPr>
+          <w:p>
+            <w:r>
+              <w:t xml:space="preserve">Contexte :  on lance juste la console, 0 machine détectée </w:t>
+            </w:r>
+          </w:p>
+          <w:p>
+            <w:r>
+              <w:t xml:space="preserve">Action :  Rentrer le nom de la classe dans laquelle on se trouve et appuyer sur le bouton recherche </w:t>
+            </w:r>
+          </w:p>
+          <w:p>
+            <w:r>
+              <w:t>Résultat :   La liste des machines de la classe apparait et on voit leurs états de connexion (Hors ligne, Allumé, En ligne)</w:t>
+            </w:r>
+          </w:p>
+        </w:tc>
+        <w:tc>
+          <w:tcPr>
+            <w:tcW w:w="0" w:type="auto"/>
+          </w:tcPr>
+          <w:p>
+            <w:r>
+              <w:t>OK</w:t>
+            </w:r>
+          </w:p>
+          <w:p>
+            <w:r>
+              <w:t>7 Mar</w:t>
+            </w:r>
+          </w:p>
+        </w:tc>
+      </w:tr>
+    </w:tbl>
+    <w:p/>
+    <w:p>
+      <w:pPr>
+        <w:pStyle w:val="Titre3"/>
+      </w:pPr>
+      <w:r>
+        <w:t>Sprint 4</w:t>
+      </w:r>
+    </w:p>
+    <w:p/>
+    <w:p>
+      <w:pPr>
+        <w:pStyle w:val="Titre4"/>
+      </w:pPr>
+      <w:r>
+        <w:lastRenderedPageBreak/>
+        <w:t>Démarrer/</w:t>
+      </w:r>
+      <w:r>
+        <w:t>Clôturer</w:t>
+      </w:r>
+      <w:r>
+        <w:t xml:space="preserve"> une session de monitoring</w:t>
+      </w:r>
+    </w:p>
+    <w:tbl>
+      <w:tblPr>
+        <w:tblW w:w="8926" w:type="dxa"/>
+        <w:tblBorders>
+          <w:top w:val="single" w:sz="4" w:space="0" w:color="auto"/>
+          <w:left w:val="single" w:sz="4" w:space="0" w:color="auto"/>
+          <w:bottom w:val="single" w:sz="4" w:space="0" w:color="auto"/>
+          <w:right w:val="single" w:sz="4" w:space="0" w:color="auto"/>
+          <w:insideH w:val="single" w:sz="4" w:space="0" w:color="auto"/>
+          <w:insideV w:val="single" w:sz="4" w:space="0" w:color="auto"/>
+        </w:tblBorders>
+        <w:tblCellMar>
+          <w:left w:w="10" w:type="dxa"/>
+          <w:right w:w="10" w:type="dxa"/>
+        </w:tblCellMar>
+        <w:tblLook w:val="04A0" w:firstRow="1" w:lastRow="0" w:firstColumn="1" w:lastColumn="0" w:noHBand="0" w:noVBand="1"/>
+      </w:tblPr>
+      <w:tblGrid>
+        <w:gridCol w:w="1305"/>
+        <w:gridCol w:w="6507"/>
+        <w:gridCol w:w="1114"/>
+      </w:tblGrid>
+      <w:tr>
+        <w:tblPrEx>
+          <w:tblCellMar>
+            <w:top w:w="0" w:type="dxa"/>
+            <w:bottom w:w="0" w:type="dxa"/>
+          </w:tblCellMar>
+        </w:tblPrEx>
+        <w:tc>
+          <w:tcPr>
+            <w:tcW w:w="0" w:type="auto"/>
+          </w:tcPr>
+          <w:p>
+            <w:r>
+              <w:t>Lancement de la session</w:t>
+            </w:r>
+          </w:p>
+        </w:tc>
+        <w:tc>
+          <w:tcPr>
+            <w:tcW w:w="6507" w:type="dxa"/>
+          </w:tcPr>
+          <w:p>
+            <w:r>
+              <w:t xml:space="preserve">Contexte :  La session est fermée, au moins une machine est sélectionnée </w:t>
+            </w:r>
+          </w:p>
+          <w:p>
+            <w:r>
+              <w:t xml:space="preserve">Action :  on clique sur le bouton pour commencer le scan </w:t>
+            </w:r>
+          </w:p>
+          <w:p>
+            <w:r>
+              <w:t>Résultat :   si un dépassement arrive, on en est notifié</w:t>
+            </w:r>
+          </w:p>
+        </w:tc>
+        <w:tc>
+          <w:tcPr>
+            <w:tcW w:w="426" w:type="dxa"/>
+          </w:tcPr>
+          <w:p>
+            <w:r>
+              <w:t>Non complété</w:t>
+            </w:r>
+            <w:r>
+              <w:t>s</w:t>
+            </w:r>
+          </w:p>
+        </w:tc>
+      </w:tr>
+      <w:tr>
+        <w:tblPrEx>
+          <w:tblCellMar>
+            <w:top w:w="0" w:type="dxa"/>
+            <w:bottom w:w="0" w:type="dxa"/>
+          </w:tblCellMar>
+        </w:tblPrEx>
+        <w:tc>
+          <w:tcPr>
+            <w:tcW w:w="0" w:type="auto"/>
+          </w:tcPr>
+          <w:p>
+            <w:r>
+              <w:t>Clôture de la session</w:t>
+            </w:r>
+          </w:p>
+        </w:tc>
+        <w:tc>
+          <w:tcPr>
+            <w:tcW w:w="6507" w:type="dxa"/>
+          </w:tcPr>
+          <w:p>
+            <w:r>
+              <w:t xml:space="preserve">Contexte :  La session est ouverte, au moins une machine est sélectionnée </w:t>
+            </w:r>
+          </w:p>
+          <w:p>
+            <w:r>
+              <w:t xml:space="preserve">Action :  on clique sur le bouton pour fermer le scan </w:t>
+            </w:r>
+          </w:p>
+          <w:p>
+            <w:r>
+              <w:t>Résultat :   on est plus notifié quand un dépassement arrive</w:t>
+            </w:r>
+          </w:p>
+        </w:tc>
+        <w:tc>
+          <w:tcPr>
+            <w:tcW w:w="426" w:type="dxa"/>
+          </w:tcPr>
+          <w:p>
+            <w:r>
+              <w:t>Non complété</w:t>
+            </w:r>
+            <w:r>
+              <w:t>s</w:t>
+            </w:r>
+          </w:p>
+        </w:tc>
+      </w:tr>
+    </w:tbl>
+    <w:p/>
+    <w:p>
+      <w:pPr>
+        <w:pStyle w:val="Titre4"/>
+      </w:pPr>
+      <w:r>
+        <w:t>Afficher le Pc en rouge si un dépassement est découvert dessus</w:t>
+      </w:r>
+    </w:p>
+    <w:tbl>
+      <w:tblPr>
+        <w:tblW w:w="100" w:type="auto"/>
+        <w:tblBorders>
+          <w:top w:val="single" w:sz="4" w:space="0" w:color="auto"/>
+          <w:left w:val="single" w:sz="4" w:space="0" w:color="auto"/>
+          <w:bottom w:val="single" w:sz="4" w:space="0" w:color="auto"/>
+          <w:right w:val="single" w:sz="4" w:space="0" w:color="auto"/>
+          <w:insideH w:val="single" w:sz="4" w:space="0" w:color="auto"/>
+          <w:insideV w:val="single" w:sz="4" w:space="0" w:color="auto"/>
+        </w:tblBorders>
+        <w:tblCellMar>
+          <w:left w:w="10" w:type="dxa"/>
+          <w:right w:w="10" w:type="dxa"/>
+        </w:tblCellMar>
+        <w:tblLook w:val="04A0" w:firstRow="1" w:lastRow="0" w:firstColumn="1" w:lastColumn="0" w:noHBand="0" w:noVBand="1"/>
+      </w:tblPr>
+      <w:tblGrid>
+        <w:gridCol w:w="2096"/>
+        <w:gridCol w:w="5653"/>
+        <w:gridCol w:w="1341"/>
+      </w:tblGrid>
+      <w:tr>
+        <w:tblPrEx>
+          <w:tblCellMar>
+            <w:top w:w="0" w:type="dxa"/>
+            <w:bottom w:w="0" w:type="dxa"/>
+          </w:tblCellMar>
+        </w:tblPrEx>
+        <w:tc>
+          <w:tcPr>
+            <w:tcW w:w="0" w:type="auto"/>
+          </w:tcPr>
+          <w:p>
+            <w:r>
+              <w:t>Détection de dépassement</w:t>
+            </w:r>
+          </w:p>
+        </w:tc>
+        <w:tc>
+          <w:tcPr>
+            <w:tcW w:w="0" w:type="auto"/>
+          </w:tcPr>
+          <w:p>
+            <w:r>
+              <w:t xml:space="preserve">Contexte :  on est sur la page on voit tous les pcs monitorés </w:t>
+            </w:r>
+          </w:p>
+          <w:p>
+            <w:r>
+              <w:t xml:space="preserve">Action :  un dépassement arrive sur un poste (ex : site web banni) </w:t>
+            </w:r>
+          </w:p>
+          <w:p>
+            <w:r>
+              <w:t>Résultat :   le pc sur lequel le dépassement est arrivé, le fond devient rouge pour signaler le problème</w:t>
+            </w:r>
+          </w:p>
+        </w:tc>
+        <w:tc>
+          <w:tcPr>
+            <w:tcW w:w="0" w:type="auto"/>
+          </w:tcPr>
+          <w:p>
+            <w:r>
+              <w:t>Non complété</w:t>
+            </w:r>
+            <w:r>
+              <w:t>s</w:t>
+            </w:r>
+          </w:p>
+        </w:tc>
+      </w:tr>
+    </w:tbl>
+    <w:p/>
+    <w:p>
+      <w:pPr>
+        <w:pStyle w:val="Titre4"/>
+      </w:pPr>
+      <w:r>
+        <w:t>Popup quand un dépassement est détecté (prof)</w:t>
+      </w:r>
+    </w:p>
+    <w:tbl>
+      <w:tblPr>
+        <w:tblW w:w="100" w:type="auto"/>
+        <w:tblBorders>
+          <w:top w:val="single" w:sz="4" w:space="0" w:color="auto"/>
+          <w:left w:val="single" w:sz="4" w:space="0" w:color="auto"/>
+          <w:bottom w:val="single" w:sz="4" w:space="0" w:color="auto"/>
+          <w:right w:val="single" w:sz="4" w:space="0" w:color="auto"/>
+          <w:insideH w:val="single" w:sz="4" w:space="0" w:color="auto"/>
+          <w:insideV w:val="single" w:sz="4" w:space="0" w:color="auto"/>
+        </w:tblBorders>
+        <w:tblCellMar>
+          <w:left w:w="10" w:type="dxa"/>
+          <w:right w:w="10" w:type="dxa"/>
+        </w:tblCellMar>
+        <w:tblLook w:val="04A0" w:firstRow="1" w:lastRow="0" w:firstColumn="1" w:lastColumn="0" w:noHBand="0" w:noVBand="1"/>
+      </w:tblPr>
+      <w:tblGrid>
+        <w:gridCol w:w="2249"/>
+        <w:gridCol w:w="5628"/>
+        <w:gridCol w:w="1213"/>
+      </w:tblGrid>
+      <w:tr>
+        <w:tblPrEx>
+          <w:tblCellMar>
+            <w:top w:w="0" w:type="dxa"/>
+            <w:bottom w:w="0" w:type="dxa"/>
+          </w:tblCellMar>
+        </w:tblPrEx>
+        <w:tc>
+          <w:tcPr>
+            <w:tcW w:w="0" w:type="auto"/>
+          </w:tcPr>
+          <w:p>
+            <w:r>
+              <w:t>Détection d'un dépassement sur le poste d'un élève</w:t>
+            </w:r>
+          </w:p>
+        </w:tc>
+        <w:tc>
+          <w:tcPr>
+            <w:tcW w:w="0" w:type="auto"/>
+          </w:tcPr>
+          <w:p>
+            <w:r>
+              <w:t xml:space="preserve">Contexte :  on est sur le poste en train de travailler, les notifications de l'app sont actives </w:t>
+            </w:r>
+          </w:p>
+          <w:p>
+            <w:r>
+              <w:t xml:space="preserve">Action :  l'élève se rend sur un site interdit (ex : </w:t>
+            </w:r>
+            <w:proofErr w:type="spellStart"/>
+            <w:r>
+              <w:t>C</w:t>
+            </w:r>
+            <w:r>
+              <w:t>hat</w:t>
+            </w:r>
+            <w:r>
+              <w:t>GPT</w:t>
+            </w:r>
+            <w:proofErr w:type="spellEnd"/>
+            <w:r>
+              <w:t xml:space="preserve"> si l'IA est interdite) Résultat :   un popup Windows nous informe du dépassement avec le nom de la ressource interdite, le nom de la machine et de l'utilisateur</w:t>
+            </w:r>
+          </w:p>
+        </w:tc>
+        <w:tc>
+          <w:tcPr>
+            <w:tcW w:w="0" w:type="auto"/>
+          </w:tcPr>
+          <w:p>
+            <w:r>
+              <w:t>Non complété</w:t>
+            </w:r>
+            <w:r>
+              <w:t>s</w:t>
+            </w:r>
+          </w:p>
+        </w:tc>
+      </w:tr>
+    </w:tbl>
     <w:p>
       <w:pPr>
         <w:pStyle w:val="Titre2"/>
@@ -20057,9 +21283,9 @@
         </w:rPr>
       </w:pPr>
       <w:bookmarkStart w:id="68" w:name="_Toc185663471"/>
-      <w:bookmarkStart w:id="69" w:name="_Toc25553326"/>
-      <w:bookmarkStart w:id="70" w:name="_Toc71691029"/>
-      <w:bookmarkStart w:id="71" w:name="_Toc192686682"/>
+      <w:bookmarkStart w:id="69" w:name="_Toc192686682"/>
+      <w:bookmarkStart w:id="70" w:name="_Toc25553326"/>
+      <w:bookmarkStart w:id="71" w:name="_Toc71691029"/>
       <w:r>
         <w:rPr>
           <w:i w:val="0"/>
@@ -20068,7 +21294,7 @@
         <w:t>Bilan</w:t>
       </w:r>
       <w:bookmarkEnd w:id="68"/>
-      <w:bookmarkEnd w:id="71"/>
+      <w:bookmarkEnd w:id="69"/>
     </w:p>
     <w:p>
       <w:pPr>
@@ -20211,7 +21437,6 @@
           <w:iCs/>
           <w:color w:val="FF0000"/>
         </w:rPr>
-        <w:lastRenderedPageBreak/>
         <w:t>Ce qu’on pensait faire vs ce qu’on a fait</w:t>
       </w:r>
     </w:p>
@@ -20281,7 +21506,11 @@
       </w:r>
       <w:proofErr w:type="spellEnd"/>
       <w:r>
-        <w:t xml:space="preserve"> de la sous liste des ressources bannies ne font pas la même taille que celles de la liste principale. J’ai essayé de régler ce problème mais après trop de temp perdu j’ai choisi de mettre un //TODO et de passer à la suite. </w:t>
+        <w:t xml:space="preserve"> de la sous liste des ressources bannies ne font pas la même taille que celles de la liste principale. J’ai essayé de régler ce problème mais après trop de </w:t>
+      </w:r>
+      <w:r>
+        <w:lastRenderedPageBreak/>
+        <w:t xml:space="preserve">temp perdu j’ai choisi de mettre un //TODO et de passer à la suite. </w:t>
       </w:r>
       <w:r>
         <w:rPr>
@@ -20305,7 +21534,7 @@
                     </pic:cNvPicPr>
                   </pic:nvPicPr>
                   <pic:blipFill>
-                    <a:blip r:embed="rId23">
+                    <a:blip r:embed="rId24">
                       <a:extLst>
                         <a:ext uri="{28A0092B-C50C-407E-A947-70E740481C1C}">
                           <a14:useLocalDpi xmlns:a14="http://schemas.microsoft.com/office/drawing/2010/main" val="0"/>
@@ -20541,11 +21770,7 @@
         <w:t>effectué</w:t>
       </w:r>
       <w:r>
-        <w:t xml:space="preserve"> des recherches sur le fonctionnement mais pour les petits bug et erreurs cachée j’avais beaucoup </w:t>
-      </w:r>
-      <w:r>
-        <w:lastRenderedPageBreak/>
-        <w:t>moins de connaissances.</w:t>
+        <w:t xml:space="preserve"> des recherches sur le fonctionnement mais pour les petits bug et erreurs cachée j’avais beaucoup moins de connaissances.</w:t>
       </w:r>
       <w:r>
         <w:t xml:space="preserve"> La chose dont j’ai eu le plus besoins c’était un problème avec la version du Protocol HTTP</w:t>
@@ -20570,19 +21795,15 @@
       <w:r>
         <w:t xml:space="preserve"> m’a aussi servi à générer le petit fantôme du logo, je l’ai modifié et </w:t>
       </w:r>
-      <w:proofErr w:type="gramStart"/>
-      <w:r>
-        <w:t>ajouter</w:t>
-      </w:r>
-      <w:proofErr w:type="gramEnd"/>
+      <w:r>
+        <w:t>ajouté</w:t>
+      </w:r>
       <w:r>
         <w:t xml:space="preserve"> à une </w:t>
       </w:r>
-      <w:proofErr w:type="spellStart"/>
-      <w:r>
-        <w:t>icone</w:t>
-      </w:r>
-      <w:proofErr w:type="spellEnd"/>
+      <w:r>
+        <w:t>icône</w:t>
+      </w:r>
       <w:r>
         <w:t xml:space="preserve"> trouvée sur </w:t>
       </w:r>
@@ -20619,9 +21840,10 @@
           <w:i w:val="0"/>
           <w:iCs/>
         </w:rPr>
+        <w:lastRenderedPageBreak/>
         <w:t>Liste des documents</w:t>
       </w:r>
-      <w:bookmarkEnd w:id="69"/>
+      <w:bookmarkEnd w:id="70"/>
       <w:r>
         <w:rPr>
           <w:i w:val="0"/>
@@ -20629,7 +21851,7 @@
         </w:rPr>
         <w:t xml:space="preserve"> fournis</w:t>
       </w:r>
-      <w:bookmarkEnd w:id="70"/>
+      <w:bookmarkEnd w:id="71"/>
       <w:bookmarkEnd w:id="83"/>
     </w:p>
     <w:p>
@@ -20992,11 +22214,7 @@
         <w:ind w:left="357"/>
       </w:pPr>
       <w:r>
-        <w:t xml:space="preserve">Par la suite je pense que quelque-chose comme un rapport général d’une session de scan (test) peut-être une chose concrète et intéressante. Sinon avoir la </w:t>
-      </w:r>
-      <w:r>
-        <w:lastRenderedPageBreak/>
-        <w:t xml:space="preserve">possibilité de partager les fichier </w:t>
+        <w:t xml:space="preserve">Par la suite je pense que quelque-chose comme un rapport général d’une session de scan (test) peut-être une chose concrète et intéressante. Sinon avoir la possibilité de partager les fichier </w:t>
       </w:r>
       <w:proofErr w:type="spellStart"/>
       <w:r>
@@ -21097,6 +22315,7 @@
           <w:rFonts w:cs="Arial"/>
           <w:i/>
         </w:rPr>
+        <w:lastRenderedPageBreak/>
         <w:t>Objectifs atteints / non-atteints</w:t>
       </w:r>
     </w:p>
@@ -21223,6 +22442,53 @@
       <w:bookmarkEnd w:id="89"/>
     </w:p>
     <w:p/>
+    <w:p>
+      <w:pPr>
+        <w:pStyle w:val="Titre3"/>
+      </w:pPr>
+      <w:r>
+        <w:t>Situation de départ</w:t>
+      </w:r>
+    </w:p>
+    <w:p/>
+    <w:p>
+      <w:pPr>
+        <w:ind w:left="708"/>
+      </w:pPr>
+      <w:r>
+        <w:t xml:space="preserve">Le </w:t>
+      </w:r>
+      <w:r>
+        <w:t>but est de pouvoir vérifier l’accès des élèves à certaines ressources (sites web, applications, fichiers). Le but n’est pas de l’interdire mais de vérifier si un des élèves utilise une ressource dont l’accès lui est interdit.</w:t>
+      </w:r>
+      <w:r>
+        <w:t xml:space="preserve"> </w:t>
+      </w:r>
+    </w:p>
+    <w:p/>
+    <w:p>
+      <w:pPr>
+        <w:pStyle w:val="Titre3"/>
+      </w:pPr>
+      <w:r>
+        <w:t xml:space="preserve">Mise en œuvre </w:t>
+      </w:r>
+    </w:p>
+    <w:p/>
+    <w:p>
+      <w:pPr>
+        <w:ind w:left="708"/>
+      </w:pPr>
+    </w:p>
+    <w:p/>
+    <w:p>
+      <w:pPr>
+        <w:pStyle w:val="Titre3"/>
+      </w:pPr>
+      <w:r>
+        <w:t>Résultat final</w:t>
+      </w:r>
+    </w:p>
     <w:p>
       <w:pPr>
         <w:pStyle w:val="Titre2"/>
@@ -21277,7 +22543,7 @@
           <w:lang w:val="en-US"/>
         </w:rPr>
       </w:pPr>
-      <w:hyperlink r:id="rId24" w:history="1">
+      <w:hyperlink r:id="rId25" w:history="1">
         <w:proofErr w:type="spellStart"/>
         <w:proofErr w:type="gramStart"/>
         <w:r>
@@ -21359,7 +22625,7 @@
           <w:lang w:val="fr-CH"/>
         </w:rPr>
       </w:pPr>
-      <w:hyperlink r:id="rId25" w:history="1">
+      <w:hyperlink r:id="rId26" w:history="1">
         <w:proofErr w:type="spellStart"/>
         <w:r>
           <w:rPr>
@@ -21432,7 +22698,7 @@
           <w:lang w:val="fr-CH"/>
         </w:rPr>
       </w:pPr>
-      <w:hyperlink r:id="rId26" w:history="1">
+      <w:hyperlink r:id="rId27" w:history="1">
         <w:proofErr w:type="spellStart"/>
         <w:r>
           <w:rPr>
@@ -21498,7 +22764,7 @@
           <w:lang w:val="fr-CH"/>
         </w:rPr>
       </w:pPr>
-      <w:hyperlink r:id="rId27" w:history="1">
+      <w:hyperlink r:id="rId28" w:history="1">
         <w:r>
           <w:rPr>
             <w:rStyle w:val="Lienhypertexte"/>
@@ -21578,7 +22844,7 @@
           <w:lang w:val="fr-CH"/>
         </w:rPr>
       </w:pPr>
-      <w:hyperlink r:id="rId28" w:history="1">
+      <w:hyperlink r:id="rId29" w:history="1">
         <w:proofErr w:type="spellStart"/>
         <w:r>
           <w:rPr>
@@ -21664,7 +22930,7 @@
           <w:lang w:val="fr-CH"/>
         </w:rPr>
       </w:pPr>
-      <w:hyperlink r:id="rId29" w:history="1">
+      <w:hyperlink r:id="rId30" w:history="1">
         <w:proofErr w:type="spellStart"/>
         <w:r>
           <w:rPr>
@@ -21714,7 +22980,7 @@
           <w:lang w:val="fr-CH"/>
         </w:rPr>
       </w:pPr>
-      <w:hyperlink r:id="rId30" w:history="1">
+      <w:hyperlink r:id="rId31" w:history="1">
         <w:r>
           <w:rPr>
             <w:rStyle w:val="Lienhypertexte"/>
@@ -21794,6 +23060,7 @@
           <w:i w:val="0"/>
           <w:iCs/>
         </w:rPr>
+        <w:lastRenderedPageBreak/>
         <w:t xml:space="preserve">Journal de </w:t>
       </w:r>
       <w:bookmarkEnd w:id="92"/>
@@ -22061,6 +23328,20 @@
     </w:p>
     <w:p>
       <w:pPr>
+        <w:ind w:left="1134" w:hanging="774"/>
+        <w:rPr>
+          <w:color w:val="000000" w:themeColor="text1"/>
+        </w:rPr>
+      </w:pPr>
+      <w:r>
+        <w:rPr>
+          <w:color w:val="000000" w:themeColor="text1"/>
+        </w:rPr>
+        <w:t xml:space="preserve">Mon journal de travail est en </w:t>
+      </w:r>
+    </w:p>
+    <w:p>
+      <w:pPr>
         <w:pStyle w:val="Titre2"/>
         <w:rPr>
           <w:i w:val="0"/>
@@ -22099,7 +23380,6 @@
           <w:i w:val="0"/>
           <w:iCs/>
         </w:rPr>
-        <w:lastRenderedPageBreak/>
         <w:t>Manuel d'Utilisation</w:t>
       </w:r>
       <w:bookmarkEnd w:id="98"/>
@@ -22116,8 +23396,8 @@
         </w:rPr>
       </w:pPr>
       <w:bookmarkStart w:id="101" w:name="_Toc71703270"/>
-      <w:bookmarkStart w:id="102" w:name="_Toc25553334"/>
-      <w:bookmarkStart w:id="103" w:name="_Toc192686695"/>
+      <w:bookmarkStart w:id="102" w:name="_Toc192686695"/>
+      <w:bookmarkStart w:id="103" w:name="_Toc25553334"/>
       <w:r>
         <w:rPr>
           <w:i w:val="0"/>
@@ -22133,7 +23413,7 @@
         <w:t>rchives du projet</w:t>
       </w:r>
       <w:bookmarkEnd w:id="101"/>
-      <w:bookmarkEnd w:id="103"/>
+      <w:bookmarkEnd w:id="102"/>
       <w:r>
         <w:rPr>
           <w:i w:val="0"/>
@@ -22141,7 +23421,7 @@
         </w:rPr>
         <w:t xml:space="preserve"> </w:t>
       </w:r>
-      <w:bookmarkEnd w:id="102"/>
+      <w:bookmarkEnd w:id="103"/>
     </w:p>
     <w:p/>
     <w:p>
@@ -22173,8 +23453,8 @@
       </w:pPr>
     </w:p>
     <w:sectPr>
-      <w:headerReference w:type="default" r:id="rId31"/>
-      <w:footerReference w:type="default" r:id="rId32"/>
+      <w:headerReference w:type="default" r:id="rId32"/>
+      <w:footerReference w:type="default" r:id="rId33"/>
       <w:pgSz w:w="11906" w:h="16838" w:code="9"/>
       <w:pgMar w:top="1418" w:right="1418" w:bottom="1418" w:left="1418" w:header="720" w:footer="720" w:gutter="0"/>
       <w:cols w:space="720"/>
@@ -22871,6 +24151,92 @@
     </w:lvl>
   </w:abstractNum>
   <w:abstractNum w:abstractNumId="4" w15:restartNumberingAfterBreak="0">
+    <w:nsid w:val="21C81E51"/>
+    <w:multiLevelType w:val="hybridMultilevel"/>
+    <w:tmpl w:val="7324C59A"/>
+    <w:lvl w:ilvl="0" w:tplc="57D4BF7E">
+      <w:start w:val="1"/>
+      <w:numFmt w:val="bullet"/>
+      <w:lvlText w:val="●"/>
+      <w:lvlJc w:val="left"/>
+      <w:pPr>
+        <w:ind w:left="720" w:hanging="360"/>
+      </w:pPr>
+    </w:lvl>
+    <w:lvl w:ilvl="1" w:tplc="EADCB428">
+      <w:start w:val="1"/>
+      <w:numFmt w:val="bullet"/>
+      <w:lvlText w:val="○"/>
+      <w:lvlJc w:val="left"/>
+      <w:pPr>
+        <w:ind w:left="1440" w:hanging="360"/>
+      </w:pPr>
+    </w:lvl>
+    <w:lvl w:ilvl="2" w:tplc="0016BDB4">
+      <w:start w:val="1"/>
+      <w:numFmt w:val="bullet"/>
+      <w:lvlText w:val="■"/>
+      <w:lvlJc w:val="left"/>
+      <w:pPr>
+        <w:ind w:left="2160" w:hanging="360"/>
+      </w:pPr>
+    </w:lvl>
+    <w:lvl w:ilvl="3" w:tplc="43441D0E">
+      <w:start w:val="1"/>
+      <w:numFmt w:val="bullet"/>
+      <w:lvlText w:val="●"/>
+      <w:lvlJc w:val="left"/>
+      <w:pPr>
+        <w:ind w:left="2880" w:hanging="360"/>
+      </w:pPr>
+    </w:lvl>
+    <w:lvl w:ilvl="4" w:tplc="190C2656">
+      <w:start w:val="1"/>
+      <w:numFmt w:val="bullet"/>
+      <w:lvlText w:val="○"/>
+      <w:lvlJc w:val="left"/>
+      <w:pPr>
+        <w:ind w:left="3600" w:hanging="360"/>
+      </w:pPr>
+    </w:lvl>
+    <w:lvl w:ilvl="5" w:tplc="12B290A0">
+      <w:start w:val="1"/>
+      <w:numFmt w:val="bullet"/>
+      <w:lvlText w:val="■"/>
+      <w:lvlJc w:val="left"/>
+      <w:pPr>
+        <w:ind w:left="4320" w:hanging="360"/>
+      </w:pPr>
+    </w:lvl>
+    <w:lvl w:ilvl="6" w:tplc="F3EA0650">
+      <w:start w:val="1"/>
+      <w:numFmt w:val="bullet"/>
+      <w:lvlText w:val="●"/>
+      <w:lvlJc w:val="left"/>
+      <w:pPr>
+        <w:ind w:left="5040" w:hanging="360"/>
+      </w:pPr>
+    </w:lvl>
+    <w:lvl w:ilvl="7" w:tplc="7D8E54D6">
+      <w:start w:val="1"/>
+      <w:numFmt w:val="bullet"/>
+      <w:lvlText w:val="●"/>
+      <w:lvlJc w:val="left"/>
+      <w:pPr>
+        <w:ind w:left="5760" w:hanging="360"/>
+      </w:pPr>
+    </w:lvl>
+    <w:lvl w:ilvl="8" w:tplc="E8129ADE">
+      <w:start w:val="1"/>
+      <w:numFmt w:val="bullet"/>
+      <w:lvlText w:val="●"/>
+      <w:lvlJc w:val="left"/>
+      <w:pPr>
+        <w:ind w:left="6480" w:hanging="360"/>
+      </w:pPr>
+    </w:lvl>
+  </w:abstractNum>
+  <w:abstractNum w:abstractNumId="5" w15:restartNumberingAfterBreak="0">
     <w:nsid w:val="26776143"/>
     <w:multiLevelType w:val="hybridMultilevel"/>
     <w:tmpl w:val="5B867C26"/>
@@ -22982,7 +24348,7 @@
       </w:rPr>
     </w:lvl>
   </w:abstractNum>
-  <w:abstractNum w:abstractNumId="5" w15:restartNumberingAfterBreak="0">
+  <w:abstractNum w:abstractNumId="6" w15:restartNumberingAfterBreak="0">
     <w:nsid w:val="27A404D8"/>
     <w:multiLevelType w:val="hybridMultilevel"/>
     <w:tmpl w:val="E4483B56"/>
@@ -23122,7 +24488,7 @@
       </w:rPr>
     </w:lvl>
   </w:abstractNum>
-  <w:abstractNum w:abstractNumId="6" w15:restartNumberingAfterBreak="0">
+  <w:abstractNum w:abstractNumId="7" w15:restartNumberingAfterBreak="0">
     <w:nsid w:val="318A3916"/>
     <w:multiLevelType w:val="hybridMultilevel"/>
     <w:tmpl w:val="7EC48B9C"/>
@@ -23235,7 +24601,7 @@
       </w:rPr>
     </w:lvl>
   </w:abstractNum>
-  <w:abstractNum w:abstractNumId="7" w15:restartNumberingAfterBreak="0">
+  <w:abstractNum w:abstractNumId="8" w15:restartNumberingAfterBreak="0">
     <w:nsid w:val="408C02FF"/>
     <w:multiLevelType w:val="hybridMultilevel"/>
     <w:tmpl w:val="1C925AC4"/>
@@ -23372,7 +24738,7 @@
       </w:rPr>
     </w:lvl>
   </w:abstractNum>
-  <w:abstractNum w:abstractNumId="8" w15:restartNumberingAfterBreak="0">
+  <w:abstractNum w:abstractNumId="9" w15:restartNumberingAfterBreak="0">
     <w:nsid w:val="42F31DAB"/>
     <w:multiLevelType w:val="hybridMultilevel"/>
     <w:tmpl w:val="A46C5D1C"/>
@@ -23512,7 +24878,7 @@
       </w:rPr>
     </w:lvl>
   </w:abstractNum>
-  <w:abstractNum w:abstractNumId="9" w15:restartNumberingAfterBreak="0">
+  <w:abstractNum w:abstractNumId="10" w15:restartNumberingAfterBreak="0">
     <w:nsid w:val="5082572C"/>
     <w:multiLevelType w:val="hybridMultilevel"/>
     <w:tmpl w:val="ED4ACFA4"/>
@@ -23652,7 +25018,7 @@
       </w:rPr>
     </w:lvl>
   </w:abstractNum>
-  <w:abstractNum w:abstractNumId="10" w15:restartNumberingAfterBreak="0">
+  <w:abstractNum w:abstractNumId="11" w15:restartNumberingAfterBreak="0">
     <w:nsid w:val="52B247CA"/>
     <w:multiLevelType w:val="hybridMultilevel"/>
     <w:tmpl w:val="B7D4D45A"/>
@@ -23792,7 +25158,7 @@
       </w:rPr>
     </w:lvl>
   </w:abstractNum>
-  <w:abstractNum w:abstractNumId="11" w15:restartNumberingAfterBreak="0">
+  <w:abstractNum w:abstractNumId="12" w15:restartNumberingAfterBreak="0">
     <w:nsid w:val="54AF786F"/>
     <w:multiLevelType w:val="hybridMultilevel"/>
     <w:tmpl w:val="D6FE614A"/>
@@ -23831,6 +25197,539 @@
         <w:rFonts w:ascii="Wingdings" w:hAnsi="Wingdings" w:hint="default"/>
       </w:rPr>
     </w:lvl>
+    <w:lvl w:ilvl="3" w:tplc="100C0001">
+      <w:start w:val="1"/>
+      <w:numFmt w:val="bullet"/>
+      <w:lvlText w:val=""/>
+      <w:lvlJc w:val="left"/>
+      <w:pPr>
+        <w:ind w:left="2880" w:hanging="360"/>
+      </w:pPr>
+      <w:rPr>
+        <w:rFonts w:ascii="Symbol" w:hAnsi="Symbol" w:hint="default"/>
+      </w:rPr>
+    </w:lvl>
+    <w:lvl w:ilvl="4" w:tplc="100C0003">
+      <w:start w:val="1"/>
+      <w:numFmt w:val="bullet"/>
+      <w:lvlText w:val="o"/>
+      <w:lvlJc w:val="left"/>
+      <w:pPr>
+        <w:ind w:left="3600" w:hanging="360"/>
+      </w:pPr>
+      <w:rPr>
+        <w:rFonts w:ascii="Courier New" w:hAnsi="Courier New" w:cs="Courier New" w:hint="default"/>
+      </w:rPr>
+    </w:lvl>
+    <w:lvl w:ilvl="5" w:tplc="100C0005">
+      <w:start w:val="1"/>
+      <w:numFmt w:val="bullet"/>
+      <w:lvlText w:val=""/>
+      <w:lvlJc w:val="left"/>
+      <w:pPr>
+        <w:ind w:left="4320" w:hanging="360"/>
+      </w:pPr>
+      <w:rPr>
+        <w:rFonts w:ascii="Wingdings" w:hAnsi="Wingdings" w:hint="default"/>
+      </w:rPr>
+    </w:lvl>
+    <w:lvl w:ilvl="6" w:tplc="100C0001">
+      <w:start w:val="1"/>
+      <w:numFmt w:val="bullet"/>
+      <w:lvlText w:val=""/>
+      <w:lvlJc w:val="left"/>
+      <w:pPr>
+        <w:ind w:left="5040" w:hanging="360"/>
+      </w:pPr>
+      <w:rPr>
+        <w:rFonts w:ascii="Symbol" w:hAnsi="Symbol" w:hint="default"/>
+      </w:rPr>
+    </w:lvl>
+    <w:lvl w:ilvl="7" w:tplc="100C0003">
+      <w:start w:val="1"/>
+      <w:numFmt w:val="bullet"/>
+      <w:lvlText w:val="o"/>
+      <w:lvlJc w:val="left"/>
+      <w:pPr>
+        <w:ind w:left="5760" w:hanging="360"/>
+      </w:pPr>
+      <w:rPr>
+        <w:rFonts w:ascii="Courier New" w:hAnsi="Courier New" w:cs="Courier New" w:hint="default"/>
+      </w:rPr>
+    </w:lvl>
+    <w:lvl w:ilvl="8" w:tplc="100C0005">
+      <w:start w:val="1"/>
+      <w:numFmt w:val="bullet"/>
+      <w:lvlText w:val=""/>
+      <w:lvlJc w:val="left"/>
+      <w:pPr>
+        <w:ind w:left="6480" w:hanging="360"/>
+      </w:pPr>
+      <w:rPr>
+        <w:rFonts w:ascii="Wingdings" w:hAnsi="Wingdings" w:hint="default"/>
+      </w:rPr>
+    </w:lvl>
+  </w:abstractNum>
+  <w:abstractNum w:abstractNumId="13" w15:restartNumberingAfterBreak="0">
+    <w:nsid w:val="594C1361"/>
+    <w:multiLevelType w:val="hybridMultilevel"/>
+    <w:tmpl w:val="5C243628"/>
+    <w:lvl w:ilvl="0" w:tplc="040C0001">
+      <w:start w:val="1"/>
+      <w:numFmt w:val="bullet"/>
+      <w:lvlText w:val=""/>
+      <w:lvlJc w:val="left"/>
+      <w:pPr>
+        <w:tabs>
+          <w:tab w:val="num" w:pos="1080"/>
+        </w:tabs>
+        <w:ind w:left="1080" w:hanging="360"/>
+      </w:pPr>
+      <w:rPr>
+        <w:rFonts w:ascii="Symbol" w:hAnsi="Symbol" w:hint="default"/>
+      </w:rPr>
+    </w:lvl>
+    <w:lvl w:ilvl="1" w:tplc="040C0003" w:tentative="1">
+      <w:start w:val="1"/>
+      <w:numFmt w:val="bullet"/>
+      <w:lvlText w:val="o"/>
+      <w:lvlJc w:val="left"/>
+      <w:pPr>
+        <w:tabs>
+          <w:tab w:val="num" w:pos="1800"/>
+        </w:tabs>
+        <w:ind w:left="1800" w:hanging="360"/>
+      </w:pPr>
+      <w:rPr>
+        <w:rFonts w:ascii="Courier New" w:hAnsi="Courier New" w:hint="default"/>
+      </w:rPr>
+    </w:lvl>
+    <w:lvl w:ilvl="2" w:tplc="040C0005" w:tentative="1">
+      <w:start w:val="1"/>
+      <w:numFmt w:val="bullet"/>
+      <w:lvlText w:val=""/>
+      <w:lvlJc w:val="left"/>
+      <w:pPr>
+        <w:tabs>
+          <w:tab w:val="num" w:pos="2520"/>
+        </w:tabs>
+        <w:ind w:left="2520" w:hanging="360"/>
+      </w:pPr>
+      <w:rPr>
+        <w:rFonts w:ascii="Wingdings" w:hAnsi="Wingdings" w:hint="default"/>
+      </w:rPr>
+    </w:lvl>
+    <w:lvl w:ilvl="3" w:tplc="040C0001" w:tentative="1">
+      <w:start w:val="1"/>
+      <w:numFmt w:val="bullet"/>
+      <w:lvlText w:val=""/>
+      <w:lvlJc w:val="left"/>
+      <w:pPr>
+        <w:tabs>
+          <w:tab w:val="num" w:pos="3240"/>
+        </w:tabs>
+        <w:ind w:left="3240" w:hanging="360"/>
+      </w:pPr>
+      <w:rPr>
+        <w:rFonts w:ascii="Symbol" w:hAnsi="Symbol" w:hint="default"/>
+      </w:rPr>
+    </w:lvl>
+    <w:lvl w:ilvl="4" w:tplc="040C0003" w:tentative="1">
+      <w:start w:val="1"/>
+      <w:numFmt w:val="bullet"/>
+      <w:lvlText w:val="o"/>
+      <w:lvlJc w:val="left"/>
+      <w:pPr>
+        <w:tabs>
+          <w:tab w:val="num" w:pos="3960"/>
+        </w:tabs>
+        <w:ind w:left="3960" w:hanging="360"/>
+      </w:pPr>
+      <w:rPr>
+        <w:rFonts w:ascii="Courier New" w:hAnsi="Courier New" w:hint="default"/>
+      </w:rPr>
+    </w:lvl>
+    <w:lvl w:ilvl="5" w:tplc="040C0005" w:tentative="1">
+      <w:start w:val="1"/>
+      <w:numFmt w:val="bullet"/>
+      <w:lvlText w:val=""/>
+      <w:lvlJc w:val="left"/>
+      <w:pPr>
+        <w:tabs>
+          <w:tab w:val="num" w:pos="4680"/>
+        </w:tabs>
+        <w:ind w:left="4680" w:hanging="360"/>
+      </w:pPr>
+      <w:rPr>
+        <w:rFonts w:ascii="Wingdings" w:hAnsi="Wingdings" w:hint="default"/>
+      </w:rPr>
+    </w:lvl>
+    <w:lvl w:ilvl="6" w:tplc="040C0001" w:tentative="1">
+      <w:start w:val="1"/>
+      <w:numFmt w:val="bullet"/>
+      <w:lvlText w:val=""/>
+      <w:lvlJc w:val="left"/>
+      <w:pPr>
+        <w:tabs>
+          <w:tab w:val="num" w:pos="5400"/>
+        </w:tabs>
+        <w:ind w:left="5400" w:hanging="360"/>
+      </w:pPr>
+      <w:rPr>
+        <w:rFonts w:ascii="Symbol" w:hAnsi="Symbol" w:hint="default"/>
+      </w:rPr>
+    </w:lvl>
+    <w:lvl w:ilvl="7" w:tplc="040C0003" w:tentative="1">
+      <w:start w:val="1"/>
+      <w:numFmt w:val="bullet"/>
+      <w:lvlText w:val="o"/>
+      <w:lvlJc w:val="left"/>
+      <w:pPr>
+        <w:tabs>
+          <w:tab w:val="num" w:pos="6120"/>
+        </w:tabs>
+        <w:ind w:left="6120" w:hanging="360"/>
+      </w:pPr>
+      <w:rPr>
+        <w:rFonts w:ascii="Courier New" w:hAnsi="Courier New" w:hint="default"/>
+      </w:rPr>
+    </w:lvl>
+    <w:lvl w:ilvl="8" w:tplc="040C0005" w:tentative="1">
+      <w:start w:val="1"/>
+      <w:numFmt w:val="bullet"/>
+      <w:lvlText w:val=""/>
+      <w:lvlJc w:val="left"/>
+      <w:pPr>
+        <w:tabs>
+          <w:tab w:val="num" w:pos="6840"/>
+        </w:tabs>
+        <w:ind w:left="6840" w:hanging="360"/>
+      </w:pPr>
+      <w:rPr>
+        <w:rFonts w:ascii="Wingdings" w:hAnsi="Wingdings" w:hint="default"/>
+      </w:rPr>
+    </w:lvl>
+  </w:abstractNum>
+  <w:abstractNum w:abstractNumId="14" w15:restartNumberingAfterBreak="0">
+    <w:nsid w:val="71E06583"/>
+    <w:multiLevelType w:val="hybridMultilevel"/>
+    <w:tmpl w:val="26C81FCE"/>
+    <w:lvl w:ilvl="0" w:tplc="040C0001">
+      <w:start w:val="1"/>
+      <w:numFmt w:val="bullet"/>
+      <w:lvlText w:val=""/>
+      <w:lvlJc w:val="left"/>
+      <w:pPr>
+        <w:tabs>
+          <w:tab w:val="num" w:pos="1077"/>
+        </w:tabs>
+        <w:ind w:left="1077" w:hanging="360"/>
+      </w:pPr>
+      <w:rPr>
+        <w:rFonts w:ascii="Symbol" w:hAnsi="Symbol" w:hint="default"/>
+      </w:rPr>
+    </w:lvl>
+    <w:lvl w:ilvl="1" w:tplc="040C0003" w:tentative="1">
+      <w:start w:val="1"/>
+      <w:numFmt w:val="bullet"/>
+      <w:lvlText w:val="o"/>
+      <w:lvlJc w:val="left"/>
+      <w:pPr>
+        <w:tabs>
+          <w:tab w:val="num" w:pos="1797"/>
+        </w:tabs>
+        <w:ind w:left="1797" w:hanging="360"/>
+      </w:pPr>
+      <w:rPr>
+        <w:rFonts w:ascii="Courier New" w:hAnsi="Courier New" w:hint="default"/>
+      </w:rPr>
+    </w:lvl>
+    <w:lvl w:ilvl="2" w:tplc="040C0005" w:tentative="1">
+      <w:start w:val="1"/>
+      <w:numFmt w:val="bullet"/>
+      <w:lvlText w:val=""/>
+      <w:lvlJc w:val="left"/>
+      <w:pPr>
+        <w:tabs>
+          <w:tab w:val="num" w:pos="2517"/>
+        </w:tabs>
+        <w:ind w:left="2517" w:hanging="360"/>
+      </w:pPr>
+      <w:rPr>
+        <w:rFonts w:ascii="Wingdings" w:hAnsi="Wingdings" w:hint="default"/>
+      </w:rPr>
+    </w:lvl>
+    <w:lvl w:ilvl="3" w:tplc="040C0001" w:tentative="1">
+      <w:start w:val="1"/>
+      <w:numFmt w:val="bullet"/>
+      <w:lvlText w:val=""/>
+      <w:lvlJc w:val="left"/>
+      <w:pPr>
+        <w:tabs>
+          <w:tab w:val="num" w:pos="3237"/>
+        </w:tabs>
+        <w:ind w:left="3237" w:hanging="360"/>
+      </w:pPr>
+      <w:rPr>
+        <w:rFonts w:ascii="Symbol" w:hAnsi="Symbol" w:hint="default"/>
+      </w:rPr>
+    </w:lvl>
+    <w:lvl w:ilvl="4" w:tplc="040C0003" w:tentative="1">
+      <w:start w:val="1"/>
+      <w:numFmt w:val="bullet"/>
+      <w:lvlText w:val="o"/>
+      <w:lvlJc w:val="left"/>
+      <w:pPr>
+        <w:tabs>
+          <w:tab w:val="num" w:pos="3957"/>
+        </w:tabs>
+        <w:ind w:left="3957" w:hanging="360"/>
+      </w:pPr>
+      <w:rPr>
+        <w:rFonts w:ascii="Courier New" w:hAnsi="Courier New" w:hint="default"/>
+      </w:rPr>
+    </w:lvl>
+    <w:lvl w:ilvl="5" w:tplc="040C0005" w:tentative="1">
+      <w:start w:val="1"/>
+      <w:numFmt w:val="bullet"/>
+      <w:lvlText w:val=""/>
+      <w:lvlJc w:val="left"/>
+      <w:pPr>
+        <w:tabs>
+          <w:tab w:val="num" w:pos="4677"/>
+        </w:tabs>
+        <w:ind w:left="4677" w:hanging="360"/>
+      </w:pPr>
+      <w:rPr>
+        <w:rFonts w:ascii="Wingdings" w:hAnsi="Wingdings" w:hint="default"/>
+      </w:rPr>
+    </w:lvl>
+    <w:lvl w:ilvl="6" w:tplc="040C0001" w:tentative="1">
+      <w:start w:val="1"/>
+      <w:numFmt w:val="bullet"/>
+      <w:lvlText w:val=""/>
+      <w:lvlJc w:val="left"/>
+      <w:pPr>
+        <w:tabs>
+          <w:tab w:val="num" w:pos="5397"/>
+        </w:tabs>
+        <w:ind w:left="5397" w:hanging="360"/>
+      </w:pPr>
+      <w:rPr>
+        <w:rFonts w:ascii="Symbol" w:hAnsi="Symbol" w:hint="default"/>
+      </w:rPr>
+    </w:lvl>
+    <w:lvl w:ilvl="7" w:tplc="040C0003" w:tentative="1">
+      <w:start w:val="1"/>
+      <w:numFmt w:val="bullet"/>
+      <w:lvlText w:val="o"/>
+      <w:lvlJc w:val="left"/>
+      <w:pPr>
+        <w:tabs>
+          <w:tab w:val="num" w:pos="6117"/>
+        </w:tabs>
+        <w:ind w:left="6117" w:hanging="360"/>
+      </w:pPr>
+      <w:rPr>
+        <w:rFonts w:ascii="Courier New" w:hAnsi="Courier New" w:hint="default"/>
+      </w:rPr>
+    </w:lvl>
+    <w:lvl w:ilvl="8" w:tplc="040C0005" w:tentative="1">
+      <w:start w:val="1"/>
+      <w:numFmt w:val="bullet"/>
+      <w:lvlText w:val=""/>
+      <w:lvlJc w:val="left"/>
+      <w:pPr>
+        <w:tabs>
+          <w:tab w:val="num" w:pos="6837"/>
+        </w:tabs>
+        <w:ind w:left="6837" w:hanging="360"/>
+      </w:pPr>
+      <w:rPr>
+        <w:rFonts w:ascii="Wingdings" w:hAnsi="Wingdings" w:hint="default"/>
+      </w:rPr>
+    </w:lvl>
+  </w:abstractNum>
+  <w:abstractNum w:abstractNumId="15" w15:restartNumberingAfterBreak="0">
+    <w:nsid w:val="75A3529B"/>
+    <w:multiLevelType w:val="hybridMultilevel"/>
+    <w:tmpl w:val="819EEA64"/>
+    <w:lvl w:ilvl="0" w:tplc="90AA5250">
+      <w:start w:val="1"/>
+      <w:numFmt w:val="bullet"/>
+      <w:lvlText w:val=""/>
+      <w:lvlJc w:val="left"/>
+      <w:pPr>
+        <w:tabs>
+          <w:tab w:val="num" w:pos="1080"/>
+        </w:tabs>
+        <w:ind w:left="1080" w:hanging="360"/>
+      </w:pPr>
+      <w:rPr>
+        <w:rFonts w:ascii="Symbol" w:hAnsi="Symbol" w:hint="default"/>
+      </w:rPr>
+    </w:lvl>
+    <w:lvl w:ilvl="1" w:tplc="39ACDF64" w:tentative="1">
+      <w:start w:val="1"/>
+      <w:numFmt w:val="bullet"/>
+      <w:lvlText w:val="o"/>
+      <w:lvlJc w:val="left"/>
+      <w:pPr>
+        <w:tabs>
+          <w:tab w:val="num" w:pos="1800"/>
+        </w:tabs>
+        <w:ind w:left="1800" w:hanging="360"/>
+      </w:pPr>
+      <w:rPr>
+        <w:rFonts w:ascii="Courier New" w:hAnsi="Courier New" w:hint="default"/>
+      </w:rPr>
+    </w:lvl>
+    <w:lvl w:ilvl="2" w:tplc="78747108" w:tentative="1">
+      <w:start w:val="1"/>
+      <w:numFmt w:val="bullet"/>
+      <w:lvlText w:val=""/>
+      <w:lvlJc w:val="left"/>
+      <w:pPr>
+        <w:tabs>
+          <w:tab w:val="num" w:pos="2520"/>
+        </w:tabs>
+        <w:ind w:left="2520" w:hanging="360"/>
+      </w:pPr>
+      <w:rPr>
+        <w:rFonts w:ascii="Wingdings" w:hAnsi="Wingdings" w:hint="default"/>
+      </w:rPr>
+    </w:lvl>
+    <w:lvl w:ilvl="3" w:tplc="ACFA5E66" w:tentative="1">
+      <w:start w:val="1"/>
+      <w:numFmt w:val="bullet"/>
+      <w:lvlText w:val=""/>
+      <w:lvlJc w:val="left"/>
+      <w:pPr>
+        <w:tabs>
+          <w:tab w:val="num" w:pos="3240"/>
+        </w:tabs>
+        <w:ind w:left="3240" w:hanging="360"/>
+      </w:pPr>
+      <w:rPr>
+        <w:rFonts w:ascii="Symbol" w:hAnsi="Symbol" w:hint="default"/>
+      </w:rPr>
+    </w:lvl>
+    <w:lvl w:ilvl="4" w:tplc="ECA29DFA" w:tentative="1">
+      <w:start w:val="1"/>
+      <w:numFmt w:val="bullet"/>
+      <w:lvlText w:val="o"/>
+      <w:lvlJc w:val="left"/>
+      <w:pPr>
+        <w:tabs>
+          <w:tab w:val="num" w:pos="3960"/>
+        </w:tabs>
+        <w:ind w:left="3960" w:hanging="360"/>
+      </w:pPr>
+      <w:rPr>
+        <w:rFonts w:ascii="Courier New" w:hAnsi="Courier New" w:hint="default"/>
+      </w:rPr>
+    </w:lvl>
+    <w:lvl w:ilvl="5" w:tplc="2F72877A" w:tentative="1">
+      <w:start w:val="1"/>
+      <w:numFmt w:val="bullet"/>
+      <w:lvlText w:val=""/>
+      <w:lvlJc w:val="left"/>
+      <w:pPr>
+        <w:tabs>
+          <w:tab w:val="num" w:pos="4680"/>
+        </w:tabs>
+        <w:ind w:left="4680" w:hanging="360"/>
+      </w:pPr>
+      <w:rPr>
+        <w:rFonts w:ascii="Wingdings" w:hAnsi="Wingdings" w:hint="default"/>
+      </w:rPr>
+    </w:lvl>
+    <w:lvl w:ilvl="6" w:tplc="C96A8960" w:tentative="1">
+      <w:start w:val="1"/>
+      <w:numFmt w:val="bullet"/>
+      <w:lvlText w:val=""/>
+      <w:lvlJc w:val="left"/>
+      <w:pPr>
+        <w:tabs>
+          <w:tab w:val="num" w:pos="5400"/>
+        </w:tabs>
+        <w:ind w:left="5400" w:hanging="360"/>
+      </w:pPr>
+      <w:rPr>
+        <w:rFonts w:ascii="Symbol" w:hAnsi="Symbol" w:hint="default"/>
+      </w:rPr>
+    </w:lvl>
+    <w:lvl w:ilvl="7" w:tplc="C28AC582" w:tentative="1">
+      <w:start w:val="1"/>
+      <w:numFmt w:val="bullet"/>
+      <w:lvlText w:val="o"/>
+      <w:lvlJc w:val="left"/>
+      <w:pPr>
+        <w:tabs>
+          <w:tab w:val="num" w:pos="6120"/>
+        </w:tabs>
+        <w:ind w:left="6120" w:hanging="360"/>
+      </w:pPr>
+      <w:rPr>
+        <w:rFonts w:ascii="Courier New" w:hAnsi="Courier New" w:hint="default"/>
+      </w:rPr>
+    </w:lvl>
+    <w:lvl w:ilvl="8" w:tplc="7E006C5C" w:tentative="1">
+      <w:start w:val="1"/>
+      <w:numFmt w:val="bullet"/>
+      <w:lvlText w:val=""/>
+      <w:lvlJc w:val="left"/>
+      <w:pPr>
+        <w:tabs>
+          <w:tab w:val="num" w:pos="6840"/>
+        </w:tabs>
+        <w:ind w:left="6840" w:hanging="360"/>
+      </w:pPr>
+      <w:rPr>
+        <w:rFonts w:ascii="Wingdings" w:hAnsi="Wingdings" w:hint="default"/>
+      </w:rPr>
+    </w:lvl>
+  </w:abstractNum>
+  <w:abstractNum w:abstractNumId="16" w15:restartNumberingAfterBreak="0">
+    <w:nsid w:val="770D70A3"/>
+    <w:multiLevelType w:val="hybridMultilevel"/>
+    <w:tmpl w:val="E0E09518"/>
+    <w:lvl w:ilvl="0" w:tplc="100C0001">
+      <w:start w:val="1"/>
+      <w:numFmt w:val="bullet"/>
+      <w:lvlText w:val=""/>
+      <w:lvlJc w:val="left"/>
+      <w:pPr>
+        <w:ind w:left="720" w:hanging="360"/>
+      </w:pPr>
+      <w:rPr>
+        <w:rFonts w:ascii="Symbol" w:hAnsi="Symbol" w:hint="default"/>
+      </w:rPr>
+    </w:lvl>
+    <w:lvl w:ilvl="1" w:tplc="100C0003" w:tentative="1">
+      <w:start w:val="1"/>
+      <w:numFmt w:val="bullet"/>
+      <w:lvlText w:val="o"/>
+      <w:lvlJc w:val="left"/>
+      <w:pPr>
+        <w:ind w:left="1440" w:hanging="360"/>
+      </w:pPr>
+      <w:rPr>
+        <w:rFonts w:ascii="Courier New" w:hAnsi="Courier New" w:cs="Courier New" w:hint="default"/>
+      </w:rPr>
+    </w:lvl>
+    <w:lvl w:ilvl="2" w:tplc="100C0005" w:tentative="1">
+      <w:start w:val="1"/>
+      <w:numFmt w:val="bullet"/>
+      <w:lvlText w:val=""/>
+      <w:lvlJc w:val="left"/>
+      <w:pPr>
+        <w:ind w:left="2160" w:hanging="360"/>
+      </w:pPr>
+      <w:rPr>
+        <w:rFonts w:ascii="Wingdings" w:hAnsi="Wingdings" w:hint="default"/>
+      </w:rPr>
+    </w:lvl>
     <w:lvl w:ilvl="3" w:tplc="100C0001" w:tentative="1">
       <w:start w:val="1"/>
       <w:numFmt w:val="bullet"/>
@@ -23904,540 +25803,7 @@
       </w:rPr>
     </w:lvl>
   </w:abstractNum>
-  <w:abstractNum w:abstractNumId="12" w15:restartNumberingAfterBreak="0">
-    <w:nsid w:val="594C1361"/>
-    <w:multiLevelType w:val="hybridMultilevel"/>
-    <w:tmpl w:val="5C243628"/>
-    <w:lvl w:ilvl="0" w:tplc="040C0001">
-      <w:start w:val="1"/>
-      <w:numFmt w:val="bullet"/>
-      <w:lvlText w:val=""/>
-      <w:lvlJc w:val="left"/>
-      <w:pPr>
-        <w:tabs>
-          <w:tab w:val="num" w:pos="1080"/>
-        </w:tabs>
-        <w:ind w:left="1080" w:hanging="360"/>
-      </w:pPr>
-      <w:rPr>
-        <w:rFonts w:ascii="Symbol" w:hAnsi="Symbol" w:hint="default"/>
-      </w:rPr>
-    </w:lvl>
-    <w:lvl w:ilvl="1" w:tplc="040C0003" w:tentative="1">
-      <w:start w:val="1"/>
-      <w:numFmt w:val="bullet"/>
-      <w:lvlText w:val="o"/>
-      <w:lvlJc w:val="left"/>
-      <w:pPr>
-        <w:tabs>
-          <w:tab w:val="num" w:pos="1800"/>
-        </w:tabs>
-        <w:ind w:left="1800" w:hanging="360"/>
-      </w:pPr>
-      <w:rPr>
-        <w:rFonts w:ascii="Courier New" w:hAnsi="Courier New" w:hint="default"/>
-      </w:rPr>
-    </w:lvl>
-    <w:lvl w:ilvl="2" w:tplc="040C0005" w:tentative="1">
-      <w:start w:val="1"/>
-      <w:numFmt w:val="bullet"/>
-      <w:lvlText w:val=""/>
-      <w:lvlJc w:val="left"/>
-      <w:pPr>
-        <w:tabs>
-          <w:tab w:val="num" w:pos="2520"/>
-        </w:tabs>
-        <w:ind w:left="2520" w:hanging="360"/>
-      </w:pPr>
-      <w:rPr>
-        <w:rFonts w:ascii="Wingdings" w:hAnsi="Wingdings" w:hint="default"/>
-      </w:rPr>
-    </w:lvl>
-    <w:lvl w:ilvl="3" w:tplc="040C0001" w:tentative="1">
-      <w:start w:val="1"/>
-      <w:numFmt w:val="bullet"/>
-      <w:lvlText w:val=""/>
-      <w:lvlJc w:val="left"/>
-      <w:pPr>
-        <w:tabs>
-          <w:tab w:val="num" w:pos="3240"/>
-        </w:tabs>
-        <w:ind w:left="3240" w:hanging="360"/>
-      </w:pPr>
-      <w:rPr>
-        <w:rFonts w:ascii="Symbol" w:hAnsi="Symbol" w:hint="default"/>
-      </w:rPr>
-    </w:lvl>
-    <w:lvl w:ilvl="4" w:tplc="040C0003" w:tentative="1">
-      <w:start w:val="1"/>
-      <w:numFmt w:val="bullet"/>
-      <w:lvlText w:val="o"/>
-      <w:lvlJc w:val="left"/>
-      <w:pPr>
-        <w:tabs>
-          <w:tab w:val="num" w:pos="3960"/>
-        </w:tabs>
-        <w:ind w:left="3960" w:hanging="360"/>
-      </w:pPr>
-      <w:rPr>
-        <w:rFonts w:ascii="Courier New" w:hAnsi="Courier New" w:hint="default"/>
-      </w:rPr>
-    </w:lvl>
-    <w:lvl w:ilvl="5" w:tplc="040C0005" w:tentative="1">
-      <w:start w:val="1"/>
-      <w:numFmt w:val="bullet"/>
-      <w:lvlText w:val=""/>
-      <w:lvlJc w:val="left"/>
-      <w:pPr>
-        <w:tabs>
-          <w:tab w:val="num" w:pos="4680"/>
-        </w:tabs>
-        <w:ind w:left="4680" w:hanging="360"/>
-      </w:pPr>
-      <w:rPr>
-        <w:rFonts w:ascii="Wingdings" w:hAnsi="Wingdings" w:hint="default"/>
-      </w:rPr>
-    </w:lvl>
-    <w:lvl w:ilvl="6" w:tplc="040C0001" w:tentative="1">
-      <w:start w:val="1"/>
-      <w:numFmt w:val="bullet"/>
-      <w:lvlText w:val=""/>
-      <w:lvlJc w:val="left"/>
-      <w:pPr>
-        <w:tabs>
-          <w:tab w:val="num" w:pos="5400"/>
-        </w:tabs>
-        <w:ind w:left="5400" w:hanging="360"/>
-      </w:pPr>
-      <w:rPr>
-        <w:rFonts w:ascii="Symbol" w:hAnsi="Symbol" w:hint="default"/>
-      </w:rPr>
-    </w:lvl>
-    <w:lvl w:ilvl="7" w:tplc="040C0003" w:tentative="1">
-      <w:start w:val="1"/>
-      <w:numFmt w:val="bullet"/>
-      <w:lvlText w:val="o"/>
-      <w:lvlJc w:val="left"/>
-      <w:pPr>
-        <w:tabs>
-          <w:tab w:val="num" w:pos="6120"/>
-        </w:tabs>
-        <w:ind w:left="6120" w:hanging="360"/>
-      </w:pPr>
-      <w:rPr>
-        <w:rFonts w:ascii="Courier New" w:hAnsi="Courier New" w:hint="default"/>
-      </w:rPr>
-    </w:lvl>
-    <w:lvl w:ilvl="8" w:tplc="040C0005" w:tentative="1">
-      <w:start w:val="1"/>
-      <w:numFmt w:val="bullet"/>
-      <w:lvlText w:val=""/>
-      <w:lvlJc w:val="left"/>
-      <w:pPr>
-        <w:tabs>
-          <w:tab w:val="num" w:pos="6840"/>
-        </w:tabs>
-        <w:ind w:left="6840" w:hanging="360"/>
-      </w:pPr>
-      <w:rPr>
-        <w:rFonts w:ascii="Wingdings" w:hAnsi="Wingdings" w:hint="default"/>
-      </w:rPr>
-    </w:lvl>
-  </w:abstractNum>
-  <w:abstractNum w:abstractNumId="13" w15:restartNumberingAfterBreak="0">
-    <w:nsid w:val="71E06583"/>
-    <w:multiLevelType w:val="hybridMultilevel"/>
-    <w:tmpl w:val="26C81FCE"/>
-    <w:lvl w:ilvl="0" w:tplc="040C0001">
-      <w:start w:val="1"/>
-      <w:numFmt w:val="bullet"/>
-      <w:lvlText w:val=""/>
-      <w:lvlJc w:val="left"/>
-      <w:pPr>
-        <w:tabs>
-          <w:tab w:val="num" w:pos="1077"/>
-        </w:tabs>
-        <w:ind w:left="1077" w:hanging="360"/>
-      </w:pPr>
-      <w:rPr>
-        <w:rFonts w:ascii="Symbol" w:hAnsi="Symbol" w:hint="default"/>
-      </w:rPr>
-    </w:lvl>
-    <w:lvl w:ilvl="1" w:tplc="040C0003" w:tentative="1">
-      <w:start w:val="1"/>
-      <w:numFmt w:val="bullet"/>
-      <w:lvlText w:val="o"/>
-      <w:lvlJc w:val="left"/>
-      <w:pPr>
-        <w:tabs>
-          <w:tab w:val="num" w:pos="1797"/>
-        </w:tabs>
-        <w:ind w:left="1797" w:hanging="360"/>
-      </w:pPr>
-      <w:rPr>
-        <w:rFonts w:ascii="Courier New" w:hAnsi="Courier New" w:hint="default"/>
-      </w:rPr>
-    </w:lvl>
-    <w:lvl w:ilvl="2" w:tplc="040C0005" w:tentative="1">
-      <w:start w:val="1"/>
-      <w:numFmt w:val="bullet"/>
-      <w:lvlText w:val=""/>
-      <w:lvlJc w:val="left"/>
-      <w:pPr>
-        <w:tabs>
-          <w:tab w:val="num" w:pos="2517"/>
-        </w:tabs>
-        <w:ind w:left="2517" w:hanging="360"/>
-      </w:pPr>
-      <w:rPr>
-        <w:rFonts w:ascii="Wingdings" w:hAnsi="Wingdings" w:hint="default"/>
-      </w:rPr>
-    </w:lvl>
-    <w:lvl w:ilvl="3" w:tplc="040C0001" w:tentative="1">
-      <w:start w:val="1"/>
-      <w:numFmt w:val="bullet"/>
-      <w:lvlText w:val=""/>
-      <w:lvlJc w:val="left"/>
-      <w:pPr>
-        <w:tabs>
-          <w:tab w:val="num" w:pos="3237"/>
-        </w:tabs>
-        <w:ind w:left="3237" w:hanging="360"/>
-      </w:pPr>
-      <w:rPr>
-        <w:rFonts w:ascii="Symbol" w:hAnsi="Symbol" w:hint="default"/>
-      </w:rPr>
-    </w:lvl>
-    <w:lvl w:ilvl="4" w:tplc="040C0003" w:tentative="1">
-      <w:start w:val="1"/>
-      <w:numFmt w:val="bullet"/>
-      <w:lvlText w:val="o"/>
-      <w:lvlJc w:val="left"/>
-      <w:pPr>
-        <w:tabs>
-          <w:tab w:val="num" w:pos="3957"/>
-        </w:tabs>
-        <w:ind w:left="3957" w:hanging="360"/>
-      </w:pPr>
-      <w:rPr>
-        <w:rFonts w:ascii="Courier New" w:hAnsi="Courier New" w:hint="default"/>
-      </w:rPr>
-    </w:lvl>
-    <w:lvl w:ilvl="5" w:tplc="040C0005" w:tentative="1">
-      <w:start w:val="1"/>
-      <w:numFmt w:val="bullet"/>
-      <w:lvlText w:val=""/>
-      <w:lvlJc w:val="left"/>
-      <w:pPr>
-        <w:tabs>
-          <w:tab w:val="num" w:pos="4677"/>
-        </w:tabs>
-        <w:ind w:left="4677" w:hanging="360"/>
-      </w:pPr>
-      <w:rPr>
-        <w:rFonts w:ascii="Wingdings" w:hAnsi="Wingdings" w:hint="default"/>
-      </w:rPr>
-    </w:lvl>
-    <w:lvl w:ilvl="6" w:tplc="040C0001" w:tentative="1">
-      <w:start w:val="1"/>
-      <w:numFmt w:val="bullet"/>
-      <w:lvlText w:val=""/>
-      <w:lvlJc w:val="left"/>
-      <w:pPr>
-        <w:tabs>
-          <w:tab w:val="num" w:pos="5397"/>
-        </w:tabs>
-        <w:ind w:left="5397" w:hanging="360"/>
-      </w:pPr>
-      <w:rPr>
-        <w:rFonts w:ascii="Symbol" w:hAnsi="Symbol" w:hint="default"/>
-      </w:rPr>
-    </w:lvl>
-    <w:lvl w:ilvl="7" w:tplc="040C0003" w:tentative="1">
-      <w:start w:val="1"/>
-      <w:numFmt w:val="bullet"/>
-      <w:lvlText w:val="o"/>
-      <w:lvlJc w:val="left"/>
-      <w:pPr>
-        <w:tabs>
-          <w:tab w:val="num" w:pos="6117"/>
-        </w:tabs>
-        <w:ind w:left="6117" w:hanging="360"/>
-      </w:pPr>
-      <w:rPr>
-        <w:rFonts w:ascii="Courier New" w:hAnsi="Courier New" w:hint="default"/>
-      </w:rPr>
-    </w:lvl>
-    <w:lvl w:ilvl="8" w:tplc="040C0005" w:tentative="1">
-      <w:start w:val="1"/>
-      <w:numFmt w:val="bullet"/>
-      <w:lvlText w:val=""/>
-      <w:lvlJc w:val="left"/>
-      <w:pPr>
-        <w:tabs>
-          <w:tab w:val="num" w:pos="6837"/>
-        </w:tabs>
-        <w:ind w:left="6837" w:hanging="360"/>
-      </w:pPr>
-      <w:rPr>
-        <w:rFonts w:ascii="Wingdings" w:hAnsi="Wingdings" w:hint="default"/>
-      </w:rPr>
-    </w:lvl>
-  </w:abstractNum>
-  <w:abstractNum w:abstractNumId="14" w15:restartNumberingAfterBreak="0">
-    <w:nsid w:val="75A3529B"/>
-    <w:multiLevelType w:val="hybridMultilevel"/>
-    <w:tmpl w:val="819EEA64"/>
-    <w:lvl w:ilvl="0" w:tplc="90AA5250">
-      <w:start w:val="1"/>
-      <w:numFmt w:val="bullet"/>
-      <w:lvlText w:val=""/>
-      <w:lvlJc w:val="left"/>
-      <w:pPr>
-        <w:tabs>
-          <w:tab w:val="num" w:pos="1080"/>
-        </w:tabs>
-        <w:ind w:left="1080" w:hanging="360"/>
-      </w:pPr>
-      <w:rPr>
-        <w:rFonts w:ascii="Symbol" w:hAnsi="Symbol" w:hint="default"/>
-      </w:rPr>
-    </w:lvl>
-    <w:lvl w:ilvl="1" w:tplc="39ACDF64" w:tentative="1">
-      <w:start w:val="1"/>
-      <w:numFmt w:val="bullet"/>
-      <w:lvlText w:val="o"/>
-      <w:lvlJc w:val="left"/>
-      <w:pPr>
-        <w:tabs>
-          <w:tab w:val="num" w:pos="1800"/>
-        </w:tabs>
-        <w:ind w:left="1800" w:hanging="360"/>
-      </w:pPr>
-      <w:rPr>
-        <w:rFonts w:ascii="Courier New" w:hAnsi="Courier New" w:hint="default"/>
-      </w:rPr>
-    </w:lvl>
-    <w:lvl w:ilvl="2" w:tplc="78747108" w:tentative="1">
-      <w:start w:val="1"/>
-      <w:numFmt w:val="bullet"/>
-      <w:lvlText w:val=""/>
-      <w:lvlJc w:val="left"/>
-      <w:pPr>
-        <w:tabs>
-          <w:tab w:val="num" w:pos="2520"/>
-        </w:tabs>
-        <w:ind w:left="2520" w:hanging="360"/>
-      </w:pPr>
-      <w:rPr>
-        <w:rFonts w:ascii="Wingdings" w:hAnsi="Wingdings" w:hint="default"/>
-      </w:rPr>
-    </w:lvl>
-    <w:lvl w:ilvl="3" w:tplc="ACFA5E66" w:tentative="1">
-      <w:start w:val="1"/>
-      <w:numFmt w:val="bullet"/>
-      <w:lvlText w:val=""/>
-      <w:lvlJc w:val="left"/>
-      <w:pPr>
-        <w:tabs>
-          <w:tab w:val="num" w:pos="3240"/>
-        </w:tabs>
-        <w:ind w:left="3240" w:hanging="360"/>
-      </w:pPr>
-      <w:rPr>
-        <w:rFonts w:ascii="Symbol" w:hAnsi="Symbol" w:hint="default"/>
-      </w:rPr>
-    </w:lvl>
-    <w:lvl w:ilvl="4" w:tplc="ECA29DFA" w:tentative="1">
-      <w:start w:val="1"/>
-      <w:numFmt w:val="bullet"/>
-      <w:lvlText w:val="o"/>
-      <w:lvlJc w:val="left"/>
-      <w:pPr>
-        <w:tabs>
-          <w:tab w:val="num" w:pos="3960"/>
-        </w:tabs>
-        <w:ind w:left="3960" w:hanging="360"/>
-      </w:pPr>
-      <w:rPr>
-        <w:rFonts w:ascii="Courier New" w:hAnsi="Courier New" w:hint="default"/>
-      </w:rPr>
-    </w:lvl>
-    <w:lvl w:ilvl="5" w:tplc="2F72877A" w:tentative="1">
-      <w:start w:val="1"/>
-      <w:numFmt w:val="bullet"/>
-      <w:lvlText w:val=""/>
-      <w:lvlJc w:val="left"/>
-      <w:pPr>
-        <w:tabs>
-          <w:tab w:val="num" w:pos="4680"/>
-        </w:tabs>
-        <w:ind w:left="4680" w:hanging="360"/>
-      </w:pPr>
-      <w:rPr>
-        <w:rFonts w:ascii="Wingdings" w:hAnsi="Wingdings" w:hint="default"/>
-      </w:rPr>
-    </w:lvl>
-    <w:lvl w:ilvl="6" w:tplc="C96A8960" w:tentative="1">
-      <w:start w:val="1"/>
-      <w:numFmt w:val="bullet"/>
-      <w:lvlText w:val=""/>
-      <w:lvlJc w:val="left"/>
-      <w:pPr>
-        <w:tabs>
-          <w:tab w:val="num" w:pos="5400"/>
-        </w:tabs>
-        <w:ind w:left="5400" w:hanging="360"/>
-      </w:pPr>
-      <w:rPr>
-        <w:rFonts w:ascii="Symbol" w:hAnsi="Symbol" w:hint="default"/>
-      </w:rPr>
-    </w:lvl>
-    <w:lvl w:ilvl="7" w:tplc="C28AC582" w:tentative="1">
-      <w:start w:val="1"/>
-      <w:numFmt w:val="bullet"/>
-      <w:lvlText w:val="o"/>
-      <w:lvlJc w:val="left"/>
-      <w:pPr>
-        <w:tabs>
-          <w:tab w:val="num" w:pos="6120"/>
-        </w:tabs>
-        <w:ind w:left="6120" w:hanging="360"/>
-      </w:pPr>
-      <w:rPr>
-        <w:rFonts w:ascii="Courier New" w:hAnsi="Courier New" w:hint="default"/>
-      </w:rPr>
-    </w:lvl>
-    <w:lvl w:ilvl="8" w:tplc="7E006C5C" w:tentative="1">
-      <w:start w:val="1"/>
-      <w:numFmt w:val="bullet"/>
-      <w:lvlText w:val=""/>
-      <w:lvlJc w:val="left"/>
-      <w:pPr>
-        <w:tabs>
-          <w:tab w:val="num" w:pos="6840"/>
-        </w:tabs>
-        <w:ind w:left="6840" w:hanging="360"/>
-      </w:pPr>
-      <w:rPr>
-        <w:rFonts w:ascii="Wingdings" w:hAnsi="Wingdings" w:hint="default"/>
-      </w:rPr>
-    </w:lvl>
-  </w:abstractNum>
-  <w:abstractNum w:abstractNumId="15" w15:restartNumberingAfterBreak="0">
-    <w:nsid w:val="770D70A3"/>
-    <w:multiLevelType w:val="hybridMultilevel"/>
-    <w:tmpl w:val="E0E09518"/>
-    <w:lvl w:ilvl="0" w:tplc="100C0001">
-      <w:start w:val="1"/>
-      <w:numFmt w:val="bullet"/>
-      <w:lvlText w:val=""/>
-      <w:lvlJc w:val="left"/>
-      <w:pPr>
-        <w:ind w:left="720" w:hanging="360"/>
-      </w:pPr>
-      <w:rPr>
-        <w:rFonts w:ascii="Symbol" w:hAnsi="Symbol" w:hint="default"/>
-      </w:rPr>
-    </w:lvl>
-    <w:lvl w:ilvl="1" w:tplc="100C0003" w:tentative="1">
-      <w:start w:val="1"/>
-      <w:numFmt w:val="bullet"/>
-      <w:lvlText w:val="o"/>
-      <w:lvlJc w:val="left"/>
-      <w:pPr>
-        <w:ind w:left="1440" w:hanging="360"/>
-      </w:pPr>
-      <w:rPr>
-        <w:rFonts w:ascii="Courier New" w:hAnsi="Courier New" w:cs="Courier New" w:hint="default"/>
-      </w:rPr>
-    </w:lvl>
-    <w:lvl w:ilvl="2" w:tplc="100C0005" w:tentative="1">
-      <w:start w:val="1"/>
-      <w:numFmt w:val="bullet"/>
-      <w:lvlText w:val=""/>
-      <w:lvlJc w:val="left"/>
-      <w:pPr>
-        <w:ind w:left="2160" w:hanging="360"/>
-      </w:pPr>
-      <w:rPr>
-        <w:rFonts w:ascii="Wingdings" w:hAnsi="Wingdings" w:hint="default"/>
-      </w:rPr>
-    </w:lvl>
-    <w:lvl w:ilvl="3" w:tplc="100C0001" w:tentative="1">
-      <w:start w:val="1"/>
-      <w:numFmt w:val="bullet"/>
-      <w:lvlText w:val=""/>
-      <w:lvlJc w:val="left"/>
-      <w:pPr>
-        <w:ind w:left="2880" w:hanging="360"/>
-      </w:pPr>
-      <w:rPr>
-        <w:rFonts w:ascii="Symbol" w:hAnsi="Symbol" w:hint="default"/>
-      </w:rPr>
-    </w:lvl>
-    <w:lvl w:ilvl="4" w:tplc="100C0003" w:tentative="1">
-      <w:start w:val="1"/>
-      <w:numFmt w:val="bullet"/>
-      <w:lvlText w:val="o"/>
-      <w:lvlJc w:val="left"/>
-      <w:pPr>
-        <w:ind w:left="3600" w:hanging="360"/>
-      </w:pPr>
-      <w:rPr>
-        <w:rFonts w:ascii="Courier New" w:hAnsi="Courier New" w:cs="Courier New" w:hint="default"/>
-      </w:rPr>
-    </w:lvl>
-    <w:lvl w:ilvl="5" w:tplc="100C0005" w:tentative="1">
-      <w:start w:val="1"/>
-      <w:numFmt w:val="bullet"/>
-      <w:lvlText w:val=""/>
-      <w:lvlJc w:val="left"/>
-      <w:pPr>
-        <w:ind w:left="4320" w:hanging="360"/>
-      </w:pPr>
-      <w:rPr>
-        <w:rFonts w:ascii="Wingdings" w:hAnsi="Wingdings" w:hint="default"/>
-      </w:rPr>
-    </w:lvl>
-    <w:lvl w:ilvl="6" w:tplc="100C0001" w:tentative="1">
-      <w:start w:val="1"/>
-      <w:numFmt w:val="bullet"/>
-      <w:lvlText w:val=""/>
-      <w:lvlJc w:val="left"/>
-      <w:pPr>
-        <w:ind w:left="5040" w:hanging="360"/>
-      </w:pPr>
-      <w:rPr>
-        <w:rFonts w:ascii="Symbol" w:hAnsi="Symbol" w:hint="default"/>
-      </w:rPr>
-    </w:lvl>
-    <w:lvl w:ilvl="7" w:tplc="100C0003" w:tentative="1">
-      <w:start w:val="1"/>
-      <w:numFmt w:val="bullet"/>
-      <w:lvlText w:val="o"/>
-      <w:lvlJc w:val="left"/>
-      <w:pPr>
-        <w:ind w:left="5760" w:hanging="360"/>
-      </w:pPr>
-      <w:rPr>
-        <w:rFonts w:ascii="Courier New" w:hAnsi="Courier New" w:cs="Courier New" w:hint="default"/>
-      </w:rPr>
-    </w:lvl>
-    <w:lvl w:ilvl="8" w:tplc="100C0005" w:tentative="1">
-      <w:start w:val="1"/>
-      <w:numFmt w:val="bullet"/>
-      <w:lvlText w:val=""/>
-      <w:lvlJc w:val="left"/>
-      <w:pPr>
-        <w:ind w:left="6480" w:hanging="360"/>
-      </w:pPr>
-      <w:rPr>
-        <w:rFonts w:ascii="Wingdings" w:hAnsi="Wingdings" w:hint="default"/>
-      </w:rPr>
-    </w:lvl>
-  </w:abstractNum>
-  <w:abstractNum w:abstractNumId="16" w15:restartNumberingAfterBreak="0">
+  <w:abstractNum w:abstractNumId="17" w15:restartNumberingAfterBreak="0">
     <w:nsid w:val="7B193736"/>
     <w:multiLevelType w:val="multilevel"/>
     <w:tmpl w:val="3E0A631E"/>
@@ -24559,7 +25925,7 @@
       </w:pPr>
     </w:lvl>
   </w:abstractNum>
-  <w:abstractNum w:abstractNumId="17" w15:restartNumberingAfterBreak="0">
+  <w:abstractNum w:abstractNumId="18" w15:restartNumberingAfterBreak="0">
     <w:nsid w:val="7DD245F2"/>
     <w:multiLevelType w:val="hybridMultilevel"/>
     <w:tmpl w:val="3100450C"/>
@@ -24700,7 +26066,7 @@
     </w:lvl>
   </w:abstractNum>
   <w:num w:numId="1" w16cid:durableId="1135416972">
-    <w:abstractNumId w:val="16"/>
+    <w:abstractNumId w:val="17"/>
   </w:num>
   <w:num w:numId="2" w16cid:durableId="659961920">
     <w:abstractNumId w:val="0"/>
@@ -24709,52 +26075,58 @@
     <w:abstractNumId w:val="3"/>
   </w:num>
   <w:num w:numId="4" w16cid:durableId="421531183">
-    <w:abstractNumId w:val="14"/>
+    <w:abstractNumId w:val="15"/>
   </w:num>
   <w:num w:numId="5" w16cid:durableId="1013461990">
-    <w:abstractNumId w:val="10"/>
+    <w:abstractNumId w:val="11"/>
   </w:num>
   <w:num w:numId="6" w16cid:durableId="2031450274">
-    <w:abstractNumId w:val="5"/>
+    <w:abstractNumId w:val="6"/>
   </w:num>
   <w:num w:numId="7" w16cid:durableId="1585600979">
-    <w:abstractNumId w:val="12"/>
+    <w:abstractNumId w:val="13"/>
   </w:num>
   <w:num w:numId="8" w16cid:durableId="407119434">
-    <w:abstractNumId w:val="17"/>
+    <w:abstractNumId w:val="18"/>
   </w:num>
   <w:num w:numId="9" w16cid:durableId="497620765">
     <w:abstractNumId w:val="2"/>
   </w:num>
   <w:num w:numId="10" w16cid:durableId="1121606994">
-    <w:abstractNumId w:val="7"/>
+    <w:abstractNumId w:val="8"/>
   </w:num>
   <w:num w:numId="11" w16cid:durableId="1724137576">
+    <w:abstractNumId w:val="10"/>
+  </w:num>
+  <w:num w:numId="12" w16cid:durableId="1418164963">
     <w:abstractNumId w:val="9"/>
   </w:num>
-  <w:num w:numId="12" w16cid:durableId="1418164963">
-    <w:abstractNumId w:val="8"/>
-  </w:num>
   <w:num w:numId="13" w16cid:durableId="2143226094">
-    <w:abstractNumId w:val="13"/>
+    <w:abstractNumId w:val="14"/>
   </w:num>
   <w:num w:numId="14" w16cid:durableId="1490632179">
-    <w:abstractNumId w:val="15"/>
+    <w:abstractNumId w:val="16"/>
   </w:num>
   <w:num w:numId="15" w16cid:durableId="293101238">
-    <w:abstractNumId w:val="6"/>
+    <w:abstractNumId w:val="7"/>
   </w:num>
   <w:num w:numId="16" w16cid:durableId="228274322">
     <w:abstractNumId w:val="1"/>
   </w:num>
   <w:num w:numId="17" w16cid:durableId="1200823275">
-    <w:abstractNumId w:val="16"/>
+    <w:abstractNumId w:val="17"/>
   </w:num>
   <w:num w:numId="18" w16cid:durableId="1605917315">
-    <w:abstractNumId w:val="4"/>
+    <w:abstractNumId w:val="5"/>
   </w:num>
   <w:num w:numId="19" w16cid:durableId="716247321">
-    <w:abstractNumId w:val="11"/>
+    <w:abstractNumId w:val="12"/>
+  </w:num>
+  <w:num w:numId="20" w16cid:durableId="1716614554">
+    <w:abstractNumId w:val="4"/>
+    <w:lvlOverride w:ilvl="0">
+      <w:startOverride w:val="1"/>
+    </w:lvlOverride>
   </w:num>
   <w:numIdMacAtCleanup w:val="13"/>
 </w:numbering>
@@ -25862,12 +27234,14 @@
     <w:rsid w:val="001D0193"/>
     <w:rsid w:val="001F0DB7"/>
     <w:rsid w:val="00200AF4"/>
+    <w:rsid w:val="00234223"/>
     <w:rsid w:val="00236970"/>
     <w:rsid w:val="00352F52"/>
     <w:rsid w:val="0038539A"/>
     <w:rsid w:val="003F5E52"/>
     <w:rsid w:val="005C7A65"/>
     <w:rsid w:val="007B6861"/>
+    <w:rsid w:val="00802F51"/>
     <w:rsid w:val="00AB5062"/>
     <w:rsid w:val="00FD5A4E"/>
   </w:rsids>
@@ -26642,6 +28016,10 @@
 </file>
 
 <file path=customXml/item1.xml><?xml version="1.0" encoding="utf-8"?>
+<b:Sources xmlns:b="http://schemas.openxmlformats.org/officeDocument/2006/bibliography" xmlns="http://schemas.openxmlformats.org/officeDocument/2006/bibliography" SelectedStyle="\APASixthEditionOfficeOnline.xsl" StyleName="APA" Version="6"/>
+</file>
+
+<file path=customXml/item2.xml><?xml version="1.0" encoding="utf-8"?>
 <p:properties xmlns:p="http://schemas.microsoft.com/office/2006/metadata/properties" xmlns:xsi="http://www.w3.org/2001/XMLSchema-instance" xmlns:pc="http://schemas.microsoft.com/office/infopath/2007/PartnerControls">
   <documentManagement>
     <TaxCatchAll xmlns="dfa80de1-e9bb-4cf2-893d-d06220b3971a" xsi:nil="true"/>
@@ -26652,20 +28030,7 @@
 </p:properties>
 </file>
 
-<file path=customXml/item2.xml><?xml version="1.0" encoding="utf-8"?>
-<b:Sources xmlns:b="http://schemas.openxmlformats.org/officeDocument/2006/bibliography" xmlns="http://schemas.openxmlformats.org/officeDocument/2006/bibliography" SelectedStyle="\APASixthEditionOfficeOnline.xsl" StyleName="APA" Version="6"/>
-</file>
-
 <file path=customXml/item3.xml><?xml version="1.0" encoding="utf-8"?>
-<?mso-contentType ?>
-<FormTemplates xmlns="http://schemas.microsoft.com/sharepoint/v3/contenttype/forms">
-  <Display>DocumentLibraryForm</Display>
-  <Edit>DocumentLibraryForm</Edit>
-  <New>DocumentLibraryForm</New>
-</FormTemplates>
-</file>
-
-<file path=customXml/item4.xml><?xml version="1.0" encoding="utf-8"?>
 <ct:contentTypeSchema xmlns:ct="http://schemas.microsoft.com/office/2006/metadata/contentType" xmlns:ma="http://schemas.microsoft.com/office/2006/metadata/properties/metaAttributes" ct:_="" ma:_="" ma:contentTypeName="Document" ma:contentTypeID="0x010100E529CC47EA4E614CBF50FAFAB9B8F32B" ma:contentTypeVersion="13" ma:contentTypeDescription="Crée un document." ma:contentTypeScope="" ma:versionID="b0c7ed87d1a958e9d45e6a628dda67b2">
   <xsd:schema xmlns:xsd="http://www.w3.org/2001/XMLSchema" xmlns:xs="http://www.w3.org/2001/XMLSchema" xmlns:p="http://schemas.microsoft.com/office/2006/metadata/properties" xmlns:ns2="98d92101-24da-4498-9971-a24673344bd8" xmlns:ns3="dfa80de1-e9bb-4cf2-893d-d06220b3971a" targetNamespace="http://schemas.microsoft.com/office/2006/metadata/properties" ma:root="true" ma:fieldsID="444cf053ca299ab1a8609ad922f5c0d6" ns2:_="" ns3:_="">
     <xsd:import namespace="98d92101-24da-4498-9971-a24673344bd8"/>
@@ -26888,7 +28253,24 @@
 </ct:contentTypeSchema>
 </file>
 
+<file path=customXml/item4.xml><?xml version="1.0" encoding="utf-8"?>
+<?mso-contentType ?>
+<FormTemplates xmlns="http://schemas.microsoft.com/sharepoint/v3/contenttype/forms">
+  <Display>DocumentLibraryForm</Display>
+  <Edit>DocumentLibraryForm</Edit>
+  <New>DocumentLibraryForm</New>
+</FormTemplates>
+</file>
+
 <file path=customXml/itemProps1.xml><?xml version="1.0" encoding="utf-8"?>
+<ds:datastoreItem xmlns:ds="http://schemas.openxmlformats.org/officeDocument/2006/customXml" ds:itemID="{9ACF6904-D409-4FC3-8592-0AED3245E875}">
+  <ds:schemaRefs>
+    <ds:schemaRef ds:uri="http://schemas.openxmlformats.org/officeDocument/2006/bibliography"/>
+  </ds:schemaRefs>
+</ds:datastoreItem>
+</file>
+
+<file path=customXml/itemProps2.xml><?xml version="1.0" encoding="utf-8"?>
 <ds:datastoreItem xmlns:ds="http://schemas.openxmlformats.org/officeDocument/2006/customXml" ds:itemID="{67CD1812-8B57-456C-9CBC-7D2297210787}">
   <ds:schemaRefs>
     <ds:schemaRef ds:uri="http://schemas.microsoft.com/office/2006/metadata/properties"/>
@@ -26899,23 +28281,7 @@
 </ds:datastoreItem>
 </file>
 
-<file path=customXml/itemProps2.xml><?xml version="1.0" encoding="utf-8"?>
-<ds:datastoreItem xmlns:ds="http://schemas.openxmlformats.org/officeDocument/2006/customXml" ds:itemID="{9ACF6904-D409-4FC3-8592-0AED3245E875}">
-  <ds:schemaRefs>
-    <ds:schemaRef ds:uri="http://schemas.openxmlformats.org/officeDocument/2006/bibliography"/>
-  </ds:schemaRefs>
-</ds:datastoreItem>
-</file>
-
 <file path=customXml/itemProps3.xml><?xml version="1.0" encoding="utf-8"?>
-<ds:datastoreItem xmlns:ds="http://schemas.openxmlformats.org/officeDocument/2006/customXml" ds:itemID="{1DADA05A-DA17-4CB0-90B5-C889667DD54A}">
-  <ds:schemaRefs>
-    <ds:schemaRef ds:uri="http://schemas.microsoft.com/sharepoint/v3/contenttype/forms"/>
-  </ds:schemaRefs>
-</ds:datastoreItem>
-</file>
-
-<file path=customXml/itemProps4.xml><?xml version="1.0" encoding="utf-8"?>
 <ds:datastoreItem xmlns:ds="http://schemas.openxmlformats.org/officeDocument/2006/customXml" ds:itemID="{700D8043-C34E-4EC6-98BE-7219263EC485}">
   <ds:schemaRefs>
     <ds:schemaRef ds:uri="http://schemas.microsoft.com/office/2006/metadata/contentType"/>
@@ -26932,4 +28298,12 @@
     <ds:schemaRef ds:uri="http://schemas.microsoft.com/internal/obd"/>
   </ds:schemaRefs>
 </ds:datastoreItem>
+</file>
+
+<file path=customXml/itemProps4.xml><?xml version="1.0" encoding="utf-8"?>
+<ds:datastoreItem xmlns:ds="http://schemas.openxmlformats.org/officeDocument/2006/customXml" ds:itemID="{1DADA05A-DA17-4CB0-90B5-C889667DD54A}">
+  <ds:schemaRefs>
+    <ds:schemaRef ds:uri="http://schemas.microsoft.com/sharepoint/v3/contenttype/forms"/>
+  </ds:schemaRefs>
+</ds:datastoreItem>
 </file>
</xml_diff>